<commit_message>
feat: add camera, esp32, dashboard, payment, admin screens, docs and backend updates
</commit_message>
<xml_diff>
--- a/documentatie/Licenta - David Andrei_feedback1.docx
+++ b/documentatie/Licenta - David Andrei_feedback1.docx
@@ -4163,7 +4163,37 @@
         <w:rPr>
           <w:lang w:val="en-RO" w:eastAsia="fr-FR"/>
         </w:rPr>
-        <w:t>Obiectivul fundamental al lucrării este proiectarea și implementarea unui sistem integrat de tip Smart Parking, capabil să automatizeze complet fluxul de monitorizare a locurilor de parcare, de la detecția fizică până la afișarea pe telefonul utilizatorului. Din perspectivă funcțională, îmi propun dezvoltarea unei infrastructuri IoT robuste, bazată pe senzori de distanță și microcontrollere, care să preia rolul factorului uman în verificarea disponibilității spațiilor. Un aspect tehnic central este implementarea protocolului MQTT pentru transmisia datelor și a conexiunilor WebSocket pentru sincronizare, având ca scop eliminarea latenței; astfel, sistemul va asigura o corespondență instantanee între realitatea din teren și baza de date, garantând acuratețea informațiilor afișate.</w:t>
+        <w:t xml:space="preserve">Obiectivul fundamental al lucrării este proiectarea și implementarea unui sistem integrat de tip Smart Parking, capabil să automatizeze complet fluxul de monitorizare a locurilor de parcare, de la detecția fizică până la afișarea pe telefonul utilizatorului. Din perspectivă funcțională, îmi propun </w:t>
+      </w:r>
+      <w:r>
+        <w:t xml:space="preserve">dezvoltarea unui sistem avansat de monitorizare bazat pe tehnologii de </w:t>
+      </w:r>
+      <w:r>
+        <w:t>Computer Vision</w:t>
+      </w:r>
+      <w:r>
+        <w:t xml:space="preserve">. În locul unei rețele dense de senzori ultrasonici, am optat pentru utilizarea unui flux video centralizat, procesat în timp real pentru a identifica automat gradul de ocupare al fiecărui loc de parcare, asigurând o </w:t>
+      </w:r>
+      <w:proofErr w:type="spellStart"/>
+      <w:r>
+        <w:t>scalabilitate</w:t>
+      </w:r>
+      <w:proofErr w:type="spellEnd"/>
+      <w:r>
+        <w:t xml:space="preserve"> ridicată a soluției</w:t>
+      </w:r>
+      <w:r>
+        <w:rPr>
+          <w:lang w:val="en-RO" w:eastAsia="fr-FR"/>
+        </w:rPr>
+        <w:t xml:space="preserve">. Un aspect tehnic central este implementarea protocolului MQTT pentru transmisia datelor și a conexiunilor WebSocket pentru sincronizare, având ca scop eliminarea latenței; astfel, sistemul va asigura o </w:t>
+      </w:r>
+      <w:r>
+        <w:rPr>
+          <w:lang w:val="en-RO" w:eastAsia="fr-FR"/>
+        </w:rPr>
+        <w:lastRenderedPageBreak/>
+        <w:t>corespondență instantanee între realitatea din teren și baza de date, garantând acuratețea informațiilor afișate.</w:t>
       </w:r>
     </w:p>
     <w:p>
@@ -4177,7 +4207,6 @@
         <w:rPr>
           <w:lang w:val="en-RO" w:eastAsia="fr-FR"/>
         </w:rPr>
-        <w:lastRenderedPageBreak/>
         <w:t>În planul interacțiunii cu utilizatorul, obiectivul este realizarea unei aplicații mobile cross-platform care să transforme aceste date brute într-o interfață vizuală intuitivă. Concret, urmăresc implementarea funcționalităților de mapare dinamică, unde locurile de parcare își actualizează statusul (liber/ocupat) în timp real pe harta aplicației, fără necesitatea reîncărcării paginii. De asemenea, proiectul vizează integrarea serviciilor de geolocalizare și rutare pentru a ghida șoferul pe cel mai scurt traseu către locul identificat, optimizând timpii de manevră. Nu în ultimul rând, un obiectiv critic este securizarea întregului ecosistem prin mecanisme de autentificare și criptare a datelor, asigurând astfel un mediu operațional stabil și protejat împotriva accesului neautorizat.</w:t>
       </w:r>
     </w:p>
@@ -4392,7 +4421,233 @@
         <w:rPr>
           <w:lang w:val="ro-RO"/>
         </w:rPr>
-        <w:t>. Am descris ecosistemul ales — Dart și Flutter pentru interfață, Python pentru backend și senzorii hardware pentru detecție — explicând totodată etapele de calibrare și integrare.</w:t>
+        <w:t xml:space="preserve">. Am descris ecosistemul ales — </w:t>
+      </w:r>
+      <w:r>
+        <w:t xml:space="preserve">Dart </w:t>
+      </w:r>
+      <w:proofErr w:type="spellStart"/>
+      <w:r>
+        <w:t>și</w:t>
+      </w:r>
+      <w:proofErr w:type="spellEnd"/>
+      <w:r>
+        <w:t xml:space="preserve"> Flutter </w:t>
+      </w:r>
+      <w:proofErr w:type="spellStart"/>
+      <w:r>
+        <w:t>pentru</w:t>
+      </w:r>
+      <w:proofErr w:type="spellEnd"/>
+      <w:r>
+        <w:t xml:space="preserve"> </w:t>
+      </w:r>
+      <w:proofErr w:type="spellStart"/>
+      <w:r>
+        <w:t>interfață</w:t>
+      </w:r>
+      <w:proofErr w:type="spellEnd"/>
+      <w:r>
+        <w:t xml:space="preserve">, </w:t>
+      </w:r>
+      <w:proofErr w:type="spellStart"/>
+      <w:r>
+        <w:t>NestJS</w:t>
+      </w:r>
+      <w:proofErr w:type="spellEnd"/>
+      <w:r>
+        <w:t xml:space="preserve"> </w:t>
+      </w:r>
+      <w:proofErr w:type="spellStart"/>
+      <w:r>
+        <w:t>pentru</w:t>
+      </w:r>
+      <w:proofErr w:type="spellEnd"/>
+      <w:r>
+        <w:t xml:space="preserve"> </w:t>
+      </w:r>
+      <w:proofErr w:type="spellStart"/>
+      <w:r>
+        <w:t>logica</w:t>
+      </w:r>
+      <w:proofErr w:type="spellEnd"/>
+      <w:r>
+        <w:t xml:space="preserve"> de server</w:t>
+      </w:r>
+      <w:r>
+        <w:t xml:space="preserve"> </w:t>
+      </w:r>
+      <w:proofErr w:type="spellStart"/>
+      <w:r>
+        <w:t>și</w:t>
+      </w:r>
+      <w:proofErr w:type="spellEnd"/>
+      <w:r>
+        <w:t xml:space="preserve"> o </w:t>
+      </w:r>
+      <w:proofErr w:type="spellStart"/>
+      <w:r>
+        <w:t>unitate</w:t>
+      </w:r>
+      <w:proofErr w:type="spellEnd"/>
+      <w:r>
+        <w:t xml:space="preserve"> de </w:t>
+      </w:r>
+      <w:proofErr w:type="spellStart"/>
+      <w:r>
+        <w:t>procesare</w:t>
+      </w:r>
+      <w:proofErr w:type="spellEnd"/>
+      <w:r>
+        <w:t xml:space="preserve"> video </w:t>
+      </w:r>
+      <w:proofErr w:type="spellStart"/>
+      <w:r>
+        <w:t>bazată</w:t>
+      </w:r>
+      <w:proofErr w:type="spellEnd"/>
+      <w:r>
+        <w:t xml:space="preserve"> pe </w:t>
+      </w:r>
+      <w:r>
+        <w:t xml:space="preserve">Python </w:t>
+      </w:r>
+      <w:proofErr w:type="spellStart"/>
+      <w:r>
+        <w:t>și</w:t>
+      </w:r>
+      <w:proofErr w:type="spellEnd"/>
+      <w:r>
+        <w:t xml:space="preserve"> </w:t>
+      </w:r>
+      <w:proofErr w:type="spellStart"/>
+      <w:r>
+        <w:t>librăria</w:t>
+      </w:r>
+      <w:proofErr w:type="spellEnd"/>
+      <w:r>
+        <w:t xml:space="preserve"> OpenCV</w:t>
+      </w:r>
+      <w:r>
+        <w:t xml:space="preserve">. </w:t>
+      </w:r>
+      <w:proofErr w:type="spellStart"/>
+      <w:r>
+        <w:t>Aceasta</w:t>
+      </w:r>
+      <w:proofErr w:type="spellEnd"/>
+      <w:r>
+        <w:t xml:space="preserve"> din </w:t>
+      </w:r>
+      <w:proofErr w:type="spellStart"/>
+      <w:r>
+        <w:t>urmă</w:t>
+      </w:r>
+      <w:proofErr w:type="spellEnd"/>
+      <w:r>
+        <w:t xml:space="preserve"> </w:t>
+      </w:r>
+      <w:proofErr w:type="spellStart"/>
+      <w:r>
+        <w:t>realizează</w:t>
+      </w:r>
+      <w:proofErr w:type="spellEnd"/>
+      <w:r>
+        <w:t xml:space="preserve"> </w:t>
+      </w:r>
+      <w:proofErr w:type="spellStart"/>
+      <w:r>
+        <w:t>detecția</w:t>
+      </w:r>
+      <w:proofErr w:type="spellEnd"/>
+      <w:r>
+        <w:t xml:space="preserve"> </w:t>
+      </w:r>
+      <w:proofErr w:type="spellStart"/>
+      <w:r>
+        <w:t>inteligentă</w:t>
+      </w:r>
+      <w:proofErr w:type="spellEnd"/>
+      <w:r>
+        <w:t xml:space="preserve"> a </w:t>
+      </w:r>
+      <w:proofErr w:type="spellStart"/>
+      <w:r>
+        <w:t>vehiculelor</w:t>
+      </w:r>
+      <w:proofErr w:type="spellEnd"/>
+      <w:r>
+        <w:t xml:space="preserve">, </w:t>
+      </w:r>
+      <w:proofErr w:type="spellStart"/>
+      <w:r>
+        <w:t>în</w:t>
+      </w:r>
+      <w:proofErr w:type="spellEnd"/>
+      <w:r>
+        <w:t xml:space="preserve"> </w:t>
+      </w:r>
+      <w:proofErr w:type="spellStart"/>
+      <w:r>
+        <w:t>timp</w:t>
+      </w:r>
+      <w:proofErr w:type="spellEnd"/>
+      <w:r>
+        <w:t xml:space="preserve"> </w:t>
+      </w:r>
+      <w:proofErr w:type="spellStart"/>
+      <w:r>
+        <w:t>ce</w:t>
+      </w:r>
+      <w:proofErr w:type="spellEnd"/>
+      <w:r>
+        <w:t xml:space="preserve"> un </w:t>
+      </w:r>
+      <w:proofErr w:type="spellStart"/>
+      <w:r>
+        <w:t>modul</w:t>
+      </w:r>
+      <w:proofErr w:type="spellEnd"/>
+      <w:r>
+        <w:t xml:space="preserve"> hardware </w:t>
+      </w:r>
+      <w:proofErr w:type="spellStart"/>
+      <w:r>
+        <w:t>dedicat</w:t>
+      </w:r>
+      <w:proofErr w:type="spellEnd"/>
+      <w:r>
+        <w:t xml:space="preserve"> (Scanner QR) </w:t>
+      </w:r>
+      <w:proofErr w:type="spellStart"/>
+      <w:r>
+        <w:t>gestionează</w:t>
+      </w:r>
+      <w:proofErr w:type="spellEnd"/>
+      <w:r>
+        <w:t xml:space="preserve"> </w:t>
+      </w:r>
+      <w:proofErr w:type="spellStart"/>
+      <w:r>
+        <w:t>accesul</w:t>
+      </w:r>
+      <w:proofErr w:type="spellEnd"/>
+      <w:r>
+        <w:t xml:space="preserve"> la </w:t>
+      </w:r>
+      <w:proofErr w:type="spellStart"/>
+      <w:r>
+        <w:t>barieră</w:t>
+      </w:r>
+      <w:proofErr w:type="spellEnd"/>
+      <w:r>
+        <w:t>.</w:t>
+      </w:r>
+      <w:r>
+        <w:rPr>
+          <w:lang w:val="ro-RO"/>
+        </w:rPr>
+        <w:t xml:space="preserve"> — explicând totodată etapele de calibrare și integrare.</w:t>
       </w:r>
       <w:r>
         <w:t xml:space="preserve"> </w:t>
@@ -4460,7 +4715,6 @@
         </w:numPr>
       </w:pPr>
       <w:r>
-        <w:lastRenderedPageBreak/>
         <w:t>ASPECTE TEORETICE</w:t>
       </w:r>
     </w:p>
@@ -4534,12 +4788,20 @@
         <w:t xml:space="preserve"> </w:t>
       </w:r>
       <w:proofErr w:type="spellStart"/>
+      <w:proofErr w:type="gramStart"/>
       <w:r>
         <w:t>fizice</w:t>
       </w:r>
       <w:proofErr w:type="spellEnd"/>
       <w:r>
-        <w:t xml:space="preserve"> — </w:t>
+        <w:t xml:space="preserve"> </w:t>
+      </w:r>
+      <w:r>
+        <w:t>,</w:t>
+      </w:r>
+      <w:proofErr w:type="gramEnd"/>
+      <w:r>
+        <w:t xml:space="preserve"> </w:t>
       </w:r>
       <w:proofErr w:type="spellStart"/>
       <w:r>
@@ -4619,7 +4881,7 @@
       </w:r>
       <w:proofErr w:type="spellEnd"/>
       <w:r>
-        <w:t xml:space="preserve"> — care permit </w:t>
+        <w:t xml:space="preserve"> care permit </w:t>
       </w:r>
       <w:proofErr w:type="spellStart"/>
       <w:r>
@@ -4981,18 +5243,23 @@
         <w:t xml:space="preserve"> </w:t>
       </w:r>
       <w:proofErr w:type="spellStart"/>
+      <w:proofErr w:type="gramStart"/>
       <w:r>
         <w:t>inerte</w:t>
       </w:r>
       <w:proofErr w:type="spellEnd"/>
       <w:r>
-        <w:t xml:space="preserve"> — </w:t>
+        <w:t xml:space="preserve"> </w:t>
+      </w:r>
+      <w:r>
+        <w:t>,</w:t>
       </w:r>
       <w:proofErr w:type="spellStart"/>
       <w:r>
         <w:t>în</w:t>
       </w:r>
       <w:proofErr w:type="spellEnd"/>
+      <w:proofErr w:type="gramEnd"/>
       <w:r>
         <w:t xml:space="preserve"> </w:t>
       </w:r>
@@ -5021,18 +5288,20 @@
         <w:t xml:space="preserve"> de </w:t>
       </w:r>
       <w:proofErr w:type="spellStart"/>
+      <w:proofErr w:type="gramStart"/>
       <w:r>
         <w:t>parcare</w:t>
       </w:r>
       <w:proofErr w:type="spellEnd"/>
       <w:r>
-        <w:t xml:space="preserve"> — </w:t>
+        <w:t xml:space="preserve"> ,</w:t>
       </w:r>
       <w:proofErr w:type="spellStart"/>
       <w:r>
         <w:t>în</w:t>
       </w:r>
       <w:proofErr w:type="spellEnd"/>
+      <w:proofErr w:type="gramEnd"/>
       <w:r>
         <w:t xml:space="preserve"> </w:t>
       </w:r>
@@ -5166,14 +5435,6 @@
       </w:r>
       <w:proofErr w:type="spellStart"/>
       <w:r>
-        <w:t>senzorii</w:t>
-      </w:r>
-      <w:proofErr w:type="spellEnd"/>
-      <w:r>
-        <w:t xml:space="preserve"> (</w:t>
-      </w:r>
-      <w:proofErr w:type="spellStart"/>
-      <w:r>
         <w:t>stratul</w:t>
       </w:r>
       <w:proofErr w:type="spellEnd"/>
@@ -5186,11 +5447,99 @@
       </w:r>
       <w:proofErr w:type="spellEnd"/>
       <w:r>
-        <w:t xml:space="preserve">) </w:t>
-      </w:r>
-      <w:proofErr w:type="spellStart"/>
-      <w:r>
-        <w:t>detectează</w:t>
+        <w:t xml:space="preserve"> </w:t>
+      </w:r>
+      <w:proofErr w:type="spellStart"/>
+      <w:r>
+        <w:t>este</w:t>
+      </w:r>
+      <w:proofErr w:type="spellEnd"/>
+      <w:r>
+        <w:t xml:space="preserve"> </w:t>
+      </w:r>
+      <w:proofErr w:type="spellStart"/>
+      <w:r>
+        <w:t>reprezentat</w:t>
+      </w:r>
+      <w:proofErr w:type="spellEnd"/>
+      <w:r>
+        <w:t xml:space="preserve"> de un </w:t>
+      </w:r>
+      <w:proofErr w:type="spellStart"/>
+      <w:r>
+        <w:t>sistem</w:t>
+      </w:r>
+      <w:proofErr w:type="spellEnd"/>
+      <w:r>
+        <w:t xml:space="preserve"> de </w:t>
+      </w:r>
+      <w:proofErr w:type="spellStart"/>
+      <w:r>
+        <w:t>monitorizare</w:t>
+      </w:r>
+      <w:proofErr w:type="spellEnd"/>
+      <w:r>
+        <w:t xml:space="preserve"> video. Camera </w:t>
+      </w:r>
+      <w:proofErr w:type="spellStart"/>
+      <w:r>
+        <w:t>preia</w:t>
+      </w:r>
+      <w:proofErr w:type="spellEnd"/>
+      <w:r>
+        <w:t xml:space="preserve"> </w:t>
+      </w:r>
+      <w:proofErr w:type="spellStart"/>
+      <w:r>
+        <w:t>fluxul</w:t>
+      </w:r>
+      <w:proofErr w:type="spellEnd"/>
+      <w:r>
+        <w:t xml:space="preserve"> </w:t>
+      </w:r>
+      <w:proofErr w:type="spellStart"/>
+      <w:r>
+        <w:t>vizual</w:t>
+      </w:r>
+      <w:proofErr w:type="spellEnd"/>
+      <w:r>
+        <w:t xml:space="preserve"> din </w:t>
+      </w:r>
+      <w:proofErr w:type="spellStart"/>
+      <w:r>
+        <w:t>parcare</w:t>
+      </w:r>
+      <w:proofErr w:type="spellEnd"/>
+      <w:r>
+        <w:t xml:space="preserve">, </w:t>
+      </w:r>
+      <w:proofErr w:type="spellStart"/>
+      <w:r>
+        <w:t>iar</w:t>
+      </w:r>
+      <w:proofErr w:type="spellEnd"/>
+      <w:r>
+        <w:t xml:space="preserve"> </w:t>
+      </w:r>
+      <w:proofErr w:type="spellStart"/>
+      <w:r>
+        <w:t>algoritmii</w:t>
+      </w:r>
+      <w:proofErr w:type="spellEnd"/>
+      <w:r>
+        <w:t xml:space="preserve"> de </w:t>
+      </w:r>
+      <w:proofErr w:type="spellStart"/>
+      <w:r>
+        <w:t>procesare</w:t>
+      </w:r>
+      <w:proofErr w:type="spellEnd"/>
+      <w:r>
+        <w:t xml:space="preserve"> de imagine </w:t>
+      </w:r>
+      <w:proofErr w:type="spellStart"/>
+      <w:r>
+        <w:t>extrag</w:t>
       </w:r>
       <w:proofErr w:type="spellEnd"/>
       <w:r>
@@ -5206,43 +5555,124 @@
       </w:r>
       <w:proofErr w:type="spellStart"/>
       <w:r>
-        <w:t>fizică</w:t>
-      </w:r>
-      <w:proofErr w:type="spellEnd"/>
+        <w:t>fiecărui</w:t>
+      </w:r>
+      <w:proofErr w:type="spellEnd"/>
+      <w:r>
+        <w:t xml:space="preserve"> loc (liber/</w:t>
+      </w:r>
+      <w:proofErr w:type="spellStart"/>
+      <w:r>
+        <w:t>ocupat</w:t>
+      </w:r>
+      <w:proofErr w:type="spellEnd"/>
+      <w:r>
+        <w:t xml:space="preserve">). </w:t>
+      </w:r>
+      <w:proofErr w:type="spellStart"/>
+      <w:r>
+        <w:t>Această</w:t>
+      </w:r>
+      <w:proofErr w:type="spellEnd"/>
+      <w:r>
+        <w:t xml:space="preserve"> </w:t>
+      </w:r>
+      <w:proofErr w:type="spellStart"/>
+      <w:r>
+        <w:t>abordare</w:t>
+      </w:r>
+      <w:proofErr w:type="spellEnd"/>
+      <w:r>
+        <w:t xml:space="preserve"> de tip </w:t>
+      </w:r>
+      <w:r>
+        <w:t>Edge Computing</w:t>
+      </w:r>
+      <w:r>
+        <w:t xml:space="preserve"> </w:t>
+      </w:r>
+      <w:proofErr w:type="spellStart"/>
+      <w:r>
+        <w:t>permite</w:t>
+      </w:r>
+      <w:proofErr w:type="spellEnd"/>
+      <w:r>
+        <w:t xml:space="preserve"> </w:t>
+      </w:r>
+      <w:proofErr w:type="spellStart"/>
+      <w:r>
+        <w:t>transmiterea</w:t>
+      </w:r>
+      <w:proofErr w:type="spellEnd"/>
+      <w:r>
+        <w:t xml:space="preserve"> </w:t>
+      </w:r>
+      <w:proofErr w:type="spellStart"/>
+      <w:r>
+        <w:t>doar</w:t>
+      </w:r>
+      <w:proofErr w:type="spellEnd"/>
+      <w:r>
+        <w:t xml:space="preserve"> a </w:t>
+      </w:r>
+      <w:proofErr w:type="spellStart"/>
+      <w:r>
+        <w:t>metadatelor</w:t>
+      </w:r>
+      <w:proofErr w:type="spellEnd"/>
+      <w:r>
+        <w:t xml:space="preserve"> </w:t>
+      </w:r>
+      <w:proofErr w:type="spellStart"/>
+      <w:r>
+        <w:t>necesare</w:t>
+      </w:r>
+      <w:proofErr w:type="spellEnd"/>
+      <w:r>
+        <w:t xml:space="preserve"> </w:t>
+      </w:r>
+      <w:proofErr w:type="spellStart"/>
+      <w:r>
+        <w:t>către</w:t>
+      </w:r>
+      <w:proofErr w:type="spellEnd"/>
+      <w:r>
+        <w:t xml:space="preserve"> server </w:t>
+      </w:r>
+      <w:proofErr w:type="spellStart"/>
+      <w:r>
+        <w:t>prin</w:t>
+      </w:r>
+      <w:proofErr w:type="spellEnd"/>
+      <w:r>
+        <w:t xml:space="preserve"> </w:t>
+      </w:r>
+      <w:proofErr w:type="spellStart"/>
+      <w:r>
+        <w:t>protocolul</w:t>
+      </w:r>
+      <w:proofErr w:type="spellEnd"/>
+      <w:r>
+        <w:t xml:space="preserve"> MQTT, </w:t>
+      </w:r>
+      <w:proofErr w:type="spellStart"/>
+      <w:r>
+        <w:t>optimizând</w:t>
+      </w:r>
+      <w:proofErr w:type="spellEnd"/>
+      <w:r>
+        <w:t xml:space="preserve"> </w:t>
+      </w:r>
+      <w:proofErr w:type="spellStart"/>
+      <w:r>
+        <w:t>traficul</w:t>
+      </w:r>
+      <w:proofErr w:type="spellEnd"/>
+      <w:r>
+        <w:t xml:space="preserve"> de date.</w:t>
+      </w:r>
       <w:r>
         <w:t xml:space="preserve">, </w:t>
-      </w:r>
-      <w:proofErr w:type="spellStart"/>
-      <w:r>
-        <w:t>modulele</w:t>
-      </w:r>
-      <w:proofErr w:type="spellEnd"/>
-      <w:r>
-        <w:t xml:space="preserve"> de </w:t>
-      </w:r>
-      <w:proofErr w:type="spellStart"/>
-      <w:r>
-        <w:t>comunicație</w:t>
-      </w:r>
-      <w:proofErr w:type="spellEnd"/>
-      <w:r>
-        <w:t xml:space="preserve"> transmit </w:t>
-      </w:r>
-      <w:proofErr w:type="spellStart"/>
-      <w:r>
-        <w:t>informația</w:t>
-      </w:r>
-      <w:proofErr w:type="spellEnd"/>
-      <w:r>
-        <w:t xml:space="preserve"> </w:t>
-      </w:r>
-      <w:proofErr w:type="spellStart"/>
-      <w:r>
-        <w:t>către</w:t>
-      </w:r>
-      <w:proofErr w:type="spellEnd"/>
-      <w:r>
-        <w:t xml:space="preserve"> cloud, </w:t>
       </w:r>
       <w:proofErr w:type="spellStart"/>
       <w:r>
@@ -12160,7 +12590,7 @@
           <w:lang w:eastAsia="fr-FR"/>
         </w:rPr>
         <w:drawing>
-          <wp:inline distT="0" distB="0" distL="0" distR="0" wp14:anchorId="7FFD7ECB" wp14:editId="6566B169">
+          <wp:inline distT="0" distB="0" distL="0" distR="0" wp14:anchorId="7FFD7ECB" wp14:editId="5BA7A96F">
             <wp:extent cx="2809875" cy="3151353"/>
             <wp:effectExtent l="0" t="0" r="0" b="0"/>
             <wp:docPr id="1942552397" name="Picture 4" descr="A screen shot of a computer code&#10;&#10;AI-generated content may be incorrect."/>
@@ -12398,7 +12828,7 @@
           <w:szCs w:val="28"/>
         </w:rPr>
         <w:drawing>
-          <wp:inline distT="0" distB="0" distL="0" distR="0" wp14:anchorId="5AEA5797" wp14:editId="747C7378">
+          <wp:inline distT="0" distB="0" distL="0" distR="0" wp14:anchorId="5AEA5797" wp14:editId="20724AAE">
             <wp:extent cx="3590154" cy="3371850"/>
             <wp:effectExtent l="0" t="0" r="4445" b="0"/>
             <wp:docPr id="788292339" name="Picture 5" descr="A screen shot of a computer program&#10;&#10;AI-generated content may be incorrect."/>
@@ -12598,7 +13028,7 @@
           <w:noProof/>
         </w:rPr>
         <w:drawing>
-          <wp:inline distT="0" distB="0" distL="0" distR="0" wp14:anchorId="50AAFFAA" wp14:editId="17AA1F38">
+          <wp:inline distT="0" distB="0" distL="0" distR="0" wp14:anchorId="50AAFFAA" wp14:editId="7FE8C8F5">
             <wp:extent cx="2600325" cy="2790825"/>
             <wp:effectExtent l="0" t="0" r="3175" b="3175"/>
             <wp:docPr id="1258349874" name="Picture 6" descr="A screen shot of a computer&#10;&#10;AI-generated content may be incorrect."/>
@@ -12644,7 +13074,7 @@
           <w:noProof/>
         </w:rPr>
         <w:drawing>
-          <wp:inline distT="0" distB="0" distL="0" distR="0" wp14:anchorId="670CBF76" wp14:editId="4A897DC1">
+          <wp:inline distT="0" distB="0" distL="0" distR="0" wp14:anchorId="670CBF76" wp14:editId="712051A3">
             <wp:extent cx="2695575" cy="2790825"/>
             <wp:effectExtent l="0" t="0" r="0" b="3175"/>
             <wp:docPr id="604105608" name="Picture 7" descr="A screenshot of a computer program&#10;&#10;AI-generated content may be incorrect."/>
@@ -12759,46 +13189,2305 @@
     </w:p>
     <w:p>
       <w:pPr>
-        <w:pStyle w:val="ListParagraph"/>
-      </w:pPr>
-      <w:r>
-        <w:t>Comunicarea cu senzorii IoT — inima sistemului — se face prin protocolul MQTT (Message Queuing Telemetry Transport).</w:t>
-      </w:r>
-    </w:p>
-    <w:p>
-      <w:pPr>
-        <w:pStyle w:val="ListParagraph"/>
-        <w:numPr>
-          <w:ilvl w:val="0"/>
-          <w:numId w:val="5"/>
-        </w:numPr>
-      </w:pPr>
-      <w:r>
-        <w:t>Lightweight: Este un protocol foarte ușor, perfect pentru microcontrollere și senzori care au resurse limitate.</w:t>
-      </w:r>
-    </w:p>
-    <w:p>
-      <w:pPr>
-        <w:pStyle w:val="ListParagraph"/>
-        <w:numPr>
-          <w:ilvl w:val="0"/>
-          <w:numId w:val="5"/>
-        </w:numPr>
-      </w:pPr>
-      <w:r>
-        <w:t>Publish/Subscribe: Arhitectura decuplează senzorul de server. Senzorul publică starea (ex: pe topicul parking/spot/1), iar serverul, fiind abonat la acest topic, primește mesajul instantaneu.</w:t>
-      </w:r>
-    </w:p>
-    <w:p>
-      <w:pPr>
-        <w:pStyle w:val="ListParagraph"/>
-        <w:numPr>
-          <w:ilvl w:val="0"/>
-          <w:numId w:val="5"/>
-        </w:numPr>
-      </w:pPr>
-      <w:r>
-        <w:t>Mosquitto: Ca broker de mesaje am folosit Eclipse Mosquitto, care rulează stabil într-un container Docker.</w:t>
+        <w:pStyle w:val="NormalWeb"/>
+        <w:rPr>
+          <w:lang w:eastAsia="en-GB"/>
+        </w:rPr>
+      </w:pPr>
+      <w:proofErr w:type="spellStart"/>
+      <w:r>
+        <w:rPr>
+          <w:rStyle w:val="citation-141"/>
+        </w:rPr>
+        <w:t>Comunicarea</w:t>
+      </w:r>
+      <w:proofErr w:type="spellEnd"/>
+      <w:r>
+        <w:rPr>
+          <w:rStyle w:val="citation-141"/>
+        </w:rPr>
+        <w:t xml:space="preserve"> </w:t>
+      </w:r>
+      <w:proofErr w:type="spellStart"/>
+      <w:r>
+        <w:rPr>
+          <w:rStyle w:val="citation-141"/>
+        </w:rPr>
+        <w:t>în</w:t>
+      </w:r>
+      <w:proofErr w:type="spellEnd"/>
+      <w:r>
+        <w:rPr>
+          <w:rStyle w:val="citation-141"/>
+        </w:rPr>
+        <w:t xml:space="preserve"> </w:t>
+      </w:r>
+      <w:proofErr w:type="spellStart"/>
+      <w:r>
+        <w:rPr>
+          <w:rStyle w:val="citation-141"/>
+        </w:rPr>
+        <w:t>timp</w:t>
+      </w:r>
+      <w:proofErr w:type="spellEnd"/>
+      <w:r>
+        <w:rPr>
+          <w:rStyle w:val="citation-141"/>
+        </w:rPr>
+        <w:t xml:space="preserve"> real </w:t>
+      </w:r>
+      <w:proofErr w:type="spellStart"/>
+      <w:r>
+        <w:rPr>
+          <w:rStyle w:val="citation-141"/>
+        </w:rPr>
+        <w:t>între</w:t>
+      </w:r>
+      <w:proofErr w:type="spellEnd"/>
+      <w:r>
+        <w:rPr>
+          <w:rStyle w:val="citation-141"/>
+        </w:rPr>
+        <w:t xml:space="preserve"> </w:t>
+      </w:r>
+      <w:proofErr w:type="spellStart"/>
+      <w:r>
+        <w:rPr>
+          <w:rStyle w:val="citation-141"/>
+        </w:rPr>
+        <w:t>componentele</w:t>
+      </w:r>
+      <w:proofErr w:type="spellEnd"/>
+      <w:r>
+        <w:rPr>
+          <w:rStyle w:val="citation-141"/>
+        </w:rPr>
+        <w:t xml:space="preserve"> </w:t>
+      </w:r>
+      <w:proofErr w:type="spellStart"/>
+      <w:r>
+        <w:rPr>
+          <w:rStyle w:val="citation-141"/>
+        </w:rPr>
+        <w:t>distribuite</w:t>
+      </w:r>
+      <w:proofErr w:type="spellEnd"/>
+      <w:r>
+        <w:rPr>
+          <w:rStyle w:val="citation-141"/>
+        </w:rPr>
+        <w:t xml:space="preserve"> ale </w:t>
+      </w:r>
+      <w:proofErr w:type="spellStart"/>
+      <w:r>
+        <w:rPr>
+          <w:rStyle w:val="citation-141"/>
+        </w:rPr>
+        <w:t>sistemului</w:t>
+      </w:r>
+      <w:proofErr w:type="spellEnd"/>
+      <w:r>
+        <w:rPr>
+          <w:rStyle w:val="citation-141"/>
+        </w:rPr>
+        <w:t xml:space="preserve"> Smart Parking se </w:t>
+      </w:r>
+      <w:proofErr w:type="spellStart"/>
+      <w:r>
+        <w:rPr>
+          <w:rStyle w:val="citation-141"/>
+        </w:rPr>
+        <w:t>bazează</w:t>
+      </w:r>
+      <w:proofErr w:type="spellEnd"/>
+      <w:r>
+        <w:rPr>
+          <w:rStyle w:val="citation-141"/>
+        </w:rPr>
+        <w:t xml:space="preserve"> pe </w:t>
+      </w:r>
+      <w:proofErr w:type="spellStart"/>
+      <w:r>
+        <w:rPr>
+          <w:rStyle w:val="citation-141"/>
+        </w:rPr>
+        <w:t>protocolul</w:t>
+      </w:r>
+      <w:proofErr w:type="spellEnd"/>
+      <w:r>
+        <w:rPr>
+          <w:rStyle w:val="citation-141"/>
+        </w:rPr>
+        <w:t xml:space="preserve"> MQTT (Message Queuing Telemetry Transport), ales </w:t>
+      </w:r>
+      <w:proofErr w:type="spellStart"/>
+      <w:r>
+        <w:rPr>
+          <w:rStyle w:val="citation-141"/>
+        </w:rPr>
+        <w:t>datorită</w:t>
+      </w:r>
+      <w:proofErr w:type="spellEnd"/>
+      <w:r>
+        <w:rPr>
+          <w:rStyle w:val="citation-141"/>
+        </w:rPr>
+        <w:t xml:space="preserve"> </w:t>
+      </w:r>
+      <w:proofErr w:type="spellStart"/>
+      <w:r>
+        <w:rPr>
+          <w:rStyle w:val="citation-141"/>
+        </w:rPr>
+        <w:t>eficienței</w:t>
+      </w:r>
+      <w:proofErr w:type="spellEnd"/>
+      <w:r>
+        <w:rPr>
+          <w:rStyle w:val="citation-141"/>
+        </w:rPr>
+        <w:t xml:space="preserve"> sale </w:t>
+      </w:r>
+      <w:proofErr w:type="spellStart"/>
+      <w:r>
+        <w:rPr>
+          <w:rStyle w:val="citation-141"/>
+        </w:rPr>
+        <w:t>ridicate</w:t>
+      </w:r>
+      <w:proofErr w:type="spellEnd"/>
+      <w:r>
+        <w:rPr>
+          <w:rStyle w:val="citation-141"/>
+        </w:rPr>
+        <w:t xml:space="preserve"> </w:t>
+      </w:r>
+      <w:proofErr w:type="spellStart"/>
+      <w:r>
+        <w:rPr>
+          <w:rStyle w:val="citation-141"/>
+        </w:rPr>
+        <w:t>în</w:t>
+      </w:r>
+      <w:proofErr w:type="spellEnd"/>
+      <w:r>
+        <w:rPr>
+          <w:rStyle w:val="citation-141"/>
+        </w:rPr>
+        <w:t xml:space="preserve"> </w:t>
+      </w:r>
+      <w:proofErr w:type="spellStart"/>
+      <w:r>
+        <w:rPr>
+          <w:rStyle w:val="citation-141"/>
+        </w:rPr>
+        <w:t>transmiterea</w:t>
+      </w:r>
+      <w:proofErr w:type="spellEnd"/>
+      <w:r>
+        <w:rPr>
+          <w:rStyle w:val="citation-141"/>
+        </w:rPr>
+        <w:t xml:space="preserve"> </w:t>
+      </w:r>
+      <w:proofErr w:type="spellStart"/>
+      <w:r>
+        <w:rPr>
+          <w:rStyle w:val="citation-141"/>
+        </w:rPr>
+        <w:t>datelor</w:t>
+      </w:r>
+      <w:proofErr w:type="spellEnd"/>
+      <w:r>
+        <w:rPr>
+          <w:rStyle w:val="citation-141"/>
+        </w:rPr>
+        <w:t xml:space="preserve"> cu </w:t>
+      </w:r>
+      <w:proofErr w:type="spellStart"/>
+      <w:r>
+        <w:rPr>
+          <w:rStyle w:val="citation-141"/>
+        </w:rPr>
+        <w:t>latență</w:t>
+      </w:r>
+      <w:proofErr w:type="spellEnd"/>
+      <w:r>
+        <w:rPr>
+          <w:rStyle w:val="citation-141"/>
+        </w:rPr>
+        <w:t xml:space="preserve"> </w:t>
+      </w:r>
+      <w:proofErr w:type="spellStart"/>
+      <w:r>
+        <w:rPr>
+          <w:rStyle w:val="citation-141"/>
+        </w:rPr>
+        <w:t>minimă</w:t>
+      </w:r>
+      <w:proofErr w:type="spellEnd"/>
+      <w:r>
+        <w:t xml:space="preserve">. </w:t>
+      </w:r>
+      <w:proofErr w:type="spellStart"/>
+      <w:r>
+        <w:t>În</w:t>
+      </w:r>
+      <w:proofErr w:type="spellEnd"/>
+      <w:r>
+        <w:t xml:space="preserve"> </w:t>
+      </w:r>
+      <w:proofErr w:type="spellStart"/>
+      <w:r>
+        <w:t>contextul</w:t>
+      </w:r>
+      <w:proofErr w:type="spellEnd"/>
+      <w:r>
+        <w:t xml:space="preserve"> </w:t>
+      </w:r>
+      <w:proofErr w:type="spellStart"/>
+      <w:r>
+        <w:t>noii</w:t>
+      </w:r>
+      <w:proofErr w:type="spellEnd"/>
+      <w:r>
+        <w:t xml:space="preserve"> </w:t>
+      </w:r>
+      <w:proofErr w:type="spellStart"/>
+      <w:r>
+        <w:t>arhitecturi</w:t>
+      </w:r>
+      <w:proofErr w:type="spellEnd"/>
+      <w:r>
+        <w:t xml:space="preserve">, </w:t>
+      </w:r>
+      <w:proofErr w:type="spellStart"/>
+      <w:r>
+        <w:t>acest</w:t>
+      </w:r>
+      <w:proofErr w:type="spellEnd"/>
+      <w:r>
+        <w:t xml:space="preserve"> protocol </w:t>
+      </w:r>
+      <w:proofErr w:type="spellStart"/>
+      <w:r>
+        <w:t>joacă</w:t>
+      </w:r>
+      <w:proofErr w:type="spellEnd"/>
+      <w:r>
+        <w:t xml:space="preserve"> </w:t>
+      </w:r>
+      <w:proofErr w:type="spellStart"/>
+      <w:r>
+        <w:t>rolul</w:t>
+      </w:r>
+      <w:proofErr w:type="spellEnd"/>
+      <w:r>
+        <w:t xml:space="preserve"> de </w:t>
+      </w:r>
+      <w:proofErr w:type="spellStart"/>
+      <w:r>
+        <w:t>coloană</w:t>
+      </w:r>
+      <w:proofErr w:type="spellEnd"/>
+      <w:r>
+        <w:t xml:space="preserve"> </w:t>
+      </w:r>
+      <w:proofErr w:type="spellStart"/>
+      <w:r>
+        <w:t>vertebrală</w:t>
+      </w:r>
+      <w:proofErr w:type="spellEnd"/>
+      <w:r>
+        <w:t xml:space="preserve"> </w:t>
+      </w:r>
+      <w:proofErr w:type="spellStart"/>
+      <w:r>
+        <w:t>pentru</w:t>
+      </w:r>
+      <w:proofErr w:type="spellEnd"/>
+      <w:r>
+        <w:t xml:space="preserve"> </w:t>
+      </w:r>
+      <w:proofErr w:type="spellStart"/>
+      <w:r>
+        <w:t>fluxul</w:t>
+      </w:r>
+      <w:proofErr w:type="spellEnd"/>
+      <w:r>
+        <w:t xml:space="preserve"> de </w:t>
+      </w:r>
+      <w:proofErr w:type="spellStart"/>
+      <w:r>
+        <w:t>informații</w:t>
+      </w:r>
+      <w:proofErr w:type="spellEnd"/>
+      <w:r>
+        <w:t xml:space="preserve"> </w:t>
+      </w:r>
+      <w:proofErr w:type="spellStart"/>
+      <w:r>
+        <w:t>generat</w:t>
+      </w:r>
+      <w:proofErr w:type="spellEnd"/>
+      <w:r>
+        <w:t xml:space="preserve"> de </w:t>
+      </w:r>
+      <w:proofErr w:type="spellStart"/>
+      <w:r>
+        <w:t>modulul</w:t>
+      </w:r>
+      <w:proofErr w:type="spellEnd"/>
+      <w:r>
+        <w:t xml:space="preserve"> de Computer Vision. </w:t>
+      </w:r>
+      <w:proofErr w:type="spellStart"/>
+      <w:r>
+        <w:t>Spre</w:t>
+      </w:r>
+      <w:proofErr w:type="spellEnd"/>
+      <w:r>
+        <w:t xml:space="preserve"> </w:t>
+      </w:r>
+      <w:proofErr w:type="spellStart"/>
+      <w:r>
+        <w:t>deosebire</w:t>
+      </w:r>
+      <w:proofErr w:type="spellEnd"/>
+      <w:r>
+        <w:t xml:space="preserve"> de </w:t>
+      </w:r>
+      <w:proofErr w:type="spellStart"/>
+      <w:r>
+        <w:t>sistemele</w:t>
+      </w:r>
+      <w:proofErr w:type="spellEnd"/>
+      <w:r>
+        <w:t xml:space="preserve"> </w:t>
+      </w:r>
+      <w:proofErr w:type="spellStart"/>
+      <w:r>
+        <w:t>tradiționale</w:t>
+      </w:r>
+      <w:proofErr w:type="spellEnd"/>
+      <w:r>
+        <w:t xml:space="preserve"> care </w:t>
+      </w:r>
+      <w:proofErr w:type="spellStart"/>
+      <w:r>
+        <w:t>utilizează</w:t>
+      </w:r>
+      <w:proofErr w:type="spellEnd"/>
+      <w:r>
+        <w:t xml:space="preserve"> </w:t>
+      </w:r>
+      <w:proofErr w:type="spellStart"/>
+      <w:r>
+        <w:t>senzori</w:t>
+      </w:r>
+      <w:proofErr w:type="spellEnd"/>
+      <w:r>
+        <w:t xml:space="preserve"> </w:t>
+      </w:r>
+      <w:proofErr w:type="spellStart"/>
+      <w:r>
+        <w:t>individuali</w:t>
+      </w:r>
+      <w:proofErr w:type="spellEnd"/>
+      <w:r>
+        <w:t xml:space="preserve">, </w:t>
+      </w:r>
+      <w:proofErr w:type="spellStart"/>
+      <w:r>
+        <w:t>soluția</w:t>
+      </w:r>
+      <w:proofErr w:type="spellEnd"/>
+      <w:r>
+        <w:t xml:space="preserve"> </w:t>
+      </w:r>
+      <w:proofErr w:type="spellStart"/>
+      <w:r>
+        <w:t>propusă</w:t>
+      </w:r>
+      <w:proofErr w:type="spellEnd"/>
+      <w:r>
+        <w:t xml:space="preserve"> </w:t>
+      </w:r>
+      <w:proofErr w:type="spellStart"/>
+      <w:r>
+        <w:t>folosește</w:t>
+      </w:r>
+      <w:proofErr w:type="spellEnd"/>
+      <w:r>
+        <w:t xml:space="preserve"> un script </w:t>
+      </w:r>
+      <w:proofErr w:type="spellStart"/>
+      <w:r>
+        <w:t>centralizat</w:t>
+      </w:r>
+      <w:proofErr w:type="spellEnd"/>
+      <w:r>
+        <w:t xml:space="preserve"> de </w:t>
+      </w:r>
+      <w:proofErr w:type="spellStart"/>
+      <w:r>
+        <w:t>procesare</w:t>
+      </w:r>
+      <w:proofErr w:type="spellEnd"/>
+      <w:r>
+        <w:t xml:space="preserve"> video (Python) care </w:t>
+      </w:r>
+      <w:proofErr w:type="spellStart"/>
+      <w:r>
+        <w:t>acționează</w:t>
+      </w:r>
+      <w:proofErr w:type="spellEnd"/>
+      <w:r>
+        <w:t xml:space="preserve"> ca un client MQTT </w:t>
+      </w:r>
+      <w:proofErr w:type="spellStart"/>
+      <w:r>
+        <w:t>publicator</w:t>
+      </w:r>
+      <w:proofErr w:type="spellEnd"/>
+      <w:r>
+        <w:t xml:space="preserve">. </w:t>
+      </w:r>
+      <w:proofErr w:type="spellStart"/>
+      <w:r>
+        <w:t>Acesta</w:t>
+      </w:r>
+      <w:proofErr w:type="spellEnd"/>
+      <w:r>
+        <w:t xml:space="preserve"> </w:t>
+      </w:r>
+      <w:proofErr w:type="spellStart"/>
+      <w:r>
+        <w:t>transmite</w:t>
+      </w:r>
+      <w:proofErr w:type="spellEnd"/>
+      <w:r>
+        <w:t xml:space="preserve"> </w:t>
+      </w:r>
+      <w:proofErr w:type="spellStart"/>
+      <w:r>
+        <w:t>starea</w:t>
+      </w:r>
+      <w:proofErr w:type="spellEnd"/>
+      <w:r>
+        <w:t xml:space="preserve"> </w:t>
+      </w:r>
+      <w:proofErr w:type="spellStart"/>
+      <w:r>
+        <w:t>fiecărui</w:t>
+      </w:r>
+      <w:proofErr w:type="spellEnd"/>
+      <w:r>
+        <w:t xml:space="preserve"> loc de </w:t>
+      </w:r>
+      <w:proofErr w:type="spellStart"/>
+      <w:r>
+        <w:t>parcare</w:t>
+      </w:r>
+      <w:proofErr w:type="spellEnd"/>
+      <w:r>
+        <w:t xml:space="preserve"> (liber </w:t>
+      </w:r>
+      <w:proofErr w:type="spellStart"/>
+      <w:r>
+        <w:t>sau</w:t>
+      </w:r>
+      <w:proofErr w:type="spellEnd"/>
+      <w:r>
+        <w:t xml:space="preserve"> </w:t>
+      </w:r>
+      <w:proofErr w:type="spellStart"/>
+      <w:r>
+        <w:t>ocupat</w:t>
+      </w:r>
+      <w:proofErr w:type="spellEnd"/>
+      <w:r>
+        <w:t xml:space="preserve">) </w:t>
+      </w:r>
+      <w:proofErr w:type="spellStart"/>
+      <w:r>
+        <w:t>către</w:t>
+      </w:r>
+      <w:proofErr w:type="spellEnd"/>
+      <w:r>
+        <w:t xml:space="preserve"> </w:t>
+      </w:r>
+      <w:proofErr w:type="spellStart"/>
+      <w:r>
+        <w:t>brokerul</w:t>
+      </w:r>
+      <w:proofErr w:type="spellEnd"/>
+      <w:r>
+        <w:t xml:space="preserve"> de </w:t>
+      </w:r>
+      <w:proofErr w:type="spellStart"/>
+      <w:r>
+        <w:t>mesaje</w:t>
+      </w:r>
+      <w:proofErr w:type="spellEnd"/>
+      <w:r>
+        <w:t xml:space="preserve"> </w:t>
+      </w:r>
+      <w:proofErr w:type="spellStart"/>
+      <w:r>
+        <w:t>ori</w:t>
+      </w:r>
+      <w:proofErr w:type="spellEnd"/>
+      <w:r>
+        <w:t xml:space="preserve"> de </w:t>
+      </w:r>
+      <w:proofErr w:type="spellStart"/>
+      <w:r>
+        <w:t>câte</w:t>
+      </w:r>
+      <w:proofErr w:type="spellEnd"/>
+      <w:r>
+        <w:t xml:space="preserve"> </w:t>
+      </w:r>
+      <w:proofErr w:type="spellStart"/>
+      <w:r>
+        <w:t>ori</w:t>
+      </w:r>
+      <w:proofErr w:type="spellEnd"/>
+      <w:r>
+        <w:t xml:space="preserve"> </w:t>
+      </w:r>
+      <w:proofErr w:type="spellStart"/>
+      <w:r>
+        <w:t>algoritmii</w:t>
+      </w:r>
+      <w:proofErr w:type="spellEnd"/>
+      <w:r>
+        <w:t xml:space="preserve"> de </w:t>
+      </w:r>
+      <w:proofErr w:type="spellStart"/>
+      <w:r>
+        <w:t>detecție</w:t>
+      </w:r>
+      <w:proofErr w:type="spellEnd"/>
+      <w:r>
+        <w:t xml:space="preserve"> </w:t>
+      </w:r>
+      <w:proofErr w:type="spellStart"/>
+      <w:r>
+        <w:t>identifică</w:t>
+      </w:r>
+      <w:proofErr w:type="spellEnd"/>
+      <w:r>
+        <w:t xml:space="preserve"> o </w:t>
+      </w:r>
+      <w:proofErr w:type="spellStart"/>
+      <w:r>
+        <w:t>schimbare</w:t>
+      </w:r>
+      <w:proofErr w:type="spellEnd"/>
+      <w:r>
+        <w:t xml:space="preserve"> </w:t>
+      </w:r>
+      <w:proofErr w:type="spellStart"/>
+      <w:r>
+        <w:t>în</w:t>
+      </w:r>
+      <w:proofErr w:type="spellEnd"/>
+      <w:r>
+        <w:t xml:space="preserve"> </w:t>
+      </w:r>
+      <w:proofErr w:type="spellStart"/>
+      <w:r>
+        <w:t>perimetrul</w:t>
+      </w:r>
+      <w:proofErr w:type="spellEnd"/>
+      <w:r>
+        <w:t xml:space="preserve"> </w:t>
+      </w:r>
+      <w:proofErr w:type="spellStart"/>
+      <w:r>
+        <w:t>monitorizat</w:t>
+      </w:r>
+      <w:proofErr w:type="spellEnd"/>
+      <w:r>
+        <w:t>.</w:t>
+      </w:r>
+    </w:p>
+    <w:p>
+      <w:pPr>
+        <w:pStyle w:val="NormalWeb"/>
+        <w:rPr>
+          <w:rStyle w:val="citation-138"/>
+        </w:rPr>
+      </w:pPr>
+      <w:proofErr w:type="spellStart"/>
+      <w:r>
+        <w:rPr>
+          <w:rStyle w:val="citation-140"/>
+        </w:rPr>
+        <w:lastRenderedPageBreak/>
+        <w:t>Arhitectura</w:t>
+      </w:r>
+      <w:proofErr w:type="spellEnd"/>
+      <w:r>
+        <w:rPr>
+          <w:rStyle w:val="citation-140"/>
+        </w:rPr>
+        <w:t xml:space="preserve"> de tip Publish/Subscribe a </w:t>
+      </w:r>
+      <w:proofErr w:type="spellStart"/>
+      <w:r>
+        <w:rPr>
+          <w:rStyle w:val="citation-140"/>
+        </w:rPr>
+        <w:t>protocolului</w:t>
+      </w:r>
+      <w:proofErr w:type="spellEnd"/>
+      <w:r>
+        <w:rPr>
+          <w:rStyle w:val="citation-140"/>
+        </w:rPr>
+        <w:t xml:space="preserve"> </w:t>
+      </w:r>
+      <w:proofErr w:type="spellStart"/>
+      <w:r>
+        <w:rPr>
+          <w:rStyle w:val="citation-140"/>
+        </w:rPr>
+        <w:t>permite</w:t>
+      </w:r>
+      <w:proofErr w:type="spellEnd"/>
+      <w:r>
+        <w:rPr>
+          <w:rStyle w:val="citation-140"/>
+        </w:rPr>
+        <w:t xml:space="preserve"> o </w:t>
+      </w:r>
+      <w:proofErr w:type="spellStart"/>
+      <w:r>
+        <w:rPr>
+          <w:rStyle w:val="citation-140"/>
+        </w:rPr>
+        <w:t>decuplare</w:t>
+      </w:r>
+      <w:proofErr w:type="spellEnd"/>
+      <w:r>
+        <w:rPr>
+          <w:rStyle w:val="citation-140"/>
+        </w:rPr>
+        <w:t xml:space="preserve"> </w:t>
+      </w:r>
+      <w:proofErr w:type="spellStart"/>
+      <w:r>
+        <w:rPr>
+          <w:rStyle w:val="citation-140"/>
+        </w:rPr>
+        <w:t>logică</w:t>
+      </w:r>
+      <w:proofErr w:type="spellEnd"/>
+      <w:r>
+        <w:rPr>
+          <w:rStyle w:val="citation-140"/>
+        </w:rPr>
+        <w:t xml:space="preserve"> </w:t>
+      </w:r>
+      <w:proofErr w:type="spellStart"/>
+      <w:r>
+        <w:rPr>
+          <w:rStyle w:val="citation-140"/>
+        </w:rPr>
+        <w:t>totală</w:t>
+      </w:r>
+      <w:proofErr w:type="spellEnd"/>
+      <w:r>
+        <w:rPr>
+          <w:rStyle w:val="citation-140"/>
+        </w:rPr>
+        <w:t xml:space="preserve"> </w:t>
+      </w:r>
+      <w:proofErr w:type="spellStart"/>
+      <w:r>
+        <w:rPr>
+          <w:rStyle w:val="citation-140"/>
+        </w:rPr>
+        <w:t>între</w:t>
+      </w:r>
+      <w:proofErr w:type="spellEnd"/>
+      <w:r>
+        <w:rPr>
+          <w:rStyle w:val="citation-140"/>
+        </w:rPr>
+        <w:t xml:space="preserve"> </w:t>
+      </w:r>
+      <w:proofErr w:type="spellStart"/>
+      <w:r>
+        <w:rPr>
+          <w:rStyle w:val="citation-140"/>
+        </w:rPr>
+        <w:t>unitatea</w:t>
+      </w:r>
+      <w:proofErr w:type="spellEnd"/>
+      <w:r>
+        <w:rPr>
+          <w:rStyle w:val="citation-140"/>
+        </w:rPr>
+        <w:t xml:space="preserve"> de </w:t>
+      </w:r>
+      <w:proofErr w:type="spellStart"/>
+      <w:r>
+        <w:rPr>
+          <w:rStyle w:val="citation-140"/>
+        </w:rPr>
+        <w:t>procesare</w:t>
+      </w:r>
+      <w:proofErr w:type="spellEnd"/>
+      <w:r>
+        <w:rPr>
+          <w:rStyle w:val="citation-140"/>
+        </w:rPr>
+        <w:t xml:space="preserve"> video </w:t>
+      </w:r>
+      <w:proofErr w:type="spellStart"/>
+      <w:r>
+        <w:rPr>
+          <w:rStyle w:val="citation-140"/>
+        </w:rPr>
+        <w:t>și</w:t>
+      </w:r>
+      <w:proofErr w:type="spellEnd"/>
+      <w:r>
+        <w:rPr>
+          <w:rStyle w:val="citation-140"/>
+        </w:rPr>
+        <w:t xml:space="preserve"> </w:t>
+      </w:r>
+      <w:proofErr w:type="spellStart"/>
+      <w:r>
+        <w:rPr>
+          <w:rStyle w:val="citation-140"/>
+        </w:rPr>
+        <w:t>serverul</w:t>
+      </w:r>
+      <w:proofErr w:type="spellEnd"/>
+      <w:r>
+        <w:rPr>
+          <w:rStyle w:val="citation-140"/>
+        </w:rPr>
+        <w:t xml:space="preserve"> backend</w:t>
+      </w:r>
+      <w:r>
+        <w:t xml:space="preserve">. </w:t>
+      </w:r>
+      <w:proofErr w:type="spellStart"/>
+      <w:r>
+        <w:rPr>
+          <w:rStyle w:val="citation-139"/>
+        </w:rPr>
+        <w:t>Serverul</w:t>
+      </w:r>
+      <w:proofErr w:type="spellEnd"/>
+      <w:r>
+        <w:rPr>
+          <w:rStyle w:val="citation-139"/>
+        </w:rPr>
+        <w:t xml:space="preserve"> </w:t>
+      </w:r>
+      <w:proofErr w:type="spellStart"/>
+      <w:r>
+        <w:rPr>
+          <w:rStyle w:val="citation-139"/>
+        </w:rPr>
+        <w:t>NestJS</w:t>
+      </w:r>
+      <w:proofErr w:type="spellEnd"/>
+      <w:r>
+        <w:rPr>
+          <w:rStyle w:val="citation-139"/>
+        </w:rPr>
+        <w:t xml:space="preserve"> </w:t>
+      </w:r>
+      <w:proofErr w:type="spellStart"/>
+      <w:r>
+        <w:rPr>
+          <w:rStyle w:val="citation-139"/>
+        </w:rPr>
+        <w:t>este</w:t>
+      </w:r>
+      <w:proofErr w:type="spellEnd"/>
+      <w:r>
+        <w:rPr>
+          <w:rStyle w:val="citation-139"/>
+        </w:rPr>
+        <w:t xml:space="preserve"> </w:t>
+      </w:r>
+      <w:proofErr w:type="spellStart"/>
+      <w:r>
+        <w:rPr>
+          <w:rStyle w:val="citation-139"/>
+        </w:rPr>
+        <w:t>abonat</w:t>
+      </w:r>
+      <w:proofErr w:type="spellEnd"/>
+      <w:r>
+        <w:rPr>
+          <w:rStyle w:val="citation-139"/>
+        </w:rPr>
+        <w:t xml:space="preserve"> la </w:t>
+      </w:r>
+      <w:proofErr w:type="spellStart"/>
+      <w:r>
+        <w:rPr>
+          <w:rStyle w:val="citation-139"/>
+        </w:rPr>
+        <w:t>topicurile</w:t>
+      </w:r>
+      <w:proofErr w:type="spellEnd"/>
+      <w:r>
+        <w:rPr>
+          <w:rStyle w:val="citation-139"/>
+        </w:rPr>
+        <w:t xml:space="preserve"> de tip status, </w:t>
+      </w:r>
+      <w:proofErr w:type="spellStart"/>
+      <w:r>
+        <w:rPr>
+          <w:rStyle w:val="citation-139"/>
+        </w:rPr>
+        <w:t>primind</w:t>
+      </w:r>
+      <w:proofErr w:type="spellEnd"/>
+      <w:r>
+        <w:rPr>
+          <w:rStyle w:val="citation-139"/>
+        </w:rPr>
+        <w:t xml:space="preserve"> </w:t>
+      </w:r>
+      <w:proofErr w:type="spellStart"/>
+      <w:r>
+        <w:rPr>
+          <w:rStyle w:val="citation-139"/>
+        </w:rPr>
+        <w:t>instantaneu</w:t>
+      </w:r>
+      <w:proofErr w:type="spellEnd"/>
+      <w:r>
+        <w:rPr>
+          <w:rStyle w:val="citation-139"/>
+        </w:rPr>
+        <w:t xml:space="preserve"> </w:t>
+      </w:r>
+      <w:proofErr w:type="spellStart"/>
+      <w:r>
+        <w:rPr>
+          <w:rStyle w:val="citation-139"/>
+        </w:rPr>
+        <w:t>actualizările</w:t>
+      </w:r>
+      <w:proofErr w:type="spellEnd"/>
+      <w:r>
+        <w:rPr>
+          <w:rStyle w:val="citation-139"/>
+        </w:rPr>
+        <w:t xml:space="preserve"> </w:t>
+      </w:r>
+      <w:proofErr w:type="spellStart"/>
+      <w:r>
+        <w:rPr>
+          <w:rStyle w:val="citation-139"/>
+        </w:rPr>
+        <w:t>fără</w:t>
+      </w:r>
+      <w:proofErr w:type="spellEnd"/>
+      <w:r>
+        <w:rPr>
+          <w:rStyle w:val="citation-139"/>
+        </w:rPr>
+        <w:t xml:space="preserve"> a fi </w:t>
+      </w:r>
+      <w:proofErr w:type="spellStart"/>
+      <w:r>
+        <w:rPr>
+          <w:rStyle w:val="citation-139"/>
+        </w:rPr>
+        <w:t>necesară</w:t>
+      </w:r>
+      <w:proofErr w:type="spellEnd"/>
+      <w:r>
+        <w:rPr>
+          <w:rStyle w:val="citation-139"/>
+        </w:rPr>
+        <w:t xml:space="preserve"> o </w:t>
+      </w:r>
+      <w:proofErr w:type="spellStart"/>
+      <w:r>
+        <w:rPr>
+          <w:rStyle w:val="citation-139"/>
+        </w:rPr>
+        <w:t>interogare</w:t>
+      </w:r>
+      <w:proofErr w:type="spellEnd"/>
+      <w:r>
+        <w:rPr>
+          <w:rStyle w:val="citation-139"/>
+        </w:rPr>
+        <w:t xml:space="preserve"> </w:t>
+      </w:r>
+      <w:proofErr w:type="spellStart"/>
+      <w:r>
+        <w:rPr>
+          <w:rStyle w:val="citation-139"/>
+        </w:rPr>
+        <w:t>activă</w:t>
+      </w:r>
+      <w:proofErr w:type="spellEnd"/>
+      <w:r>
+        <w:rPr>
+          <w:rStyle w:val="citation-139"/>
+        </w:rPr>
+        <w:t xml:space="preserve"> a </w:t>
+      </w:r>
+      <w:proofErr w:type="spellStart"/>
+      <w:r>
+        <w:rPr>
+          <w:rStyle w:val="citation-139"/>
+        </w:rPr>
+        <w:t>dispozitivelor</w:t>
+      </w:r>
+      <w:proofErr w:type="spellEnd"/>
+      <w:r>
+        <w:rPr>
+          <w:rStyle w:val="citation-139"/>
+        </w:rPr>
+        <w:t xml:space="preserve"> hardware</w:t>
+      </w:r>
+      <w:r>
+        <w:t xml:space="preserve">. </w:t>
+      </w:r>
+      <w:proofErr w:type="spellStart"/>
+      <w:r>
+        <w:t>Această</w:t>
+      </w:r>
+      <w:proofErr w:type="spellEnd"/>
+      <w:r>
+        <w:t xml:space="preserve"> </w:t>
+      </w:r>
+      <w:proofErr w:type="spellStart"/>
+      <w:r>
+        <w:t>abordare</w:t>
+      </w:r>
+      <w:proofErr w:type="spellEnd"/>
+      <w:r>
+        <w:t xml:space="preserve"> de tip "push" </w:t>
+      </w:r>
+      <w:proofErr w:type="spellStart"/>
+      <w:r>
+        <w:t>garantează</w:t>
+      </w:r>
+      <w:proofErr w:type="spellEnd"/>
+      <w:r>
+        <w:t xml:space="preserve"> </w:t>
+      </w:r>
+      <w:proofErr w:type="spellStart"/>
+      <w:r>
+        <w:t>că</w:t>
+      </w:r>
+      <w:proofErr w:type="spellEnd"/>
+      <w:r>
+        <w:t xml:space="preserve"> </w:t>
+      </w:r>
+      <w:proofErr w:type="spellStart"/>
+      <w:r>
+        <w:t>informația</w:t>
+      </w:r>
+      <w:proofErr w:type="spellEnd"/>
+      <w:r>
+        <w:t xml:space="preserve"> </w:t>
+      </w:r>
+      <w:proofErr w:type="spellStart"/>
+      <w:r>
+        <w:t>vizuală</w:t>
+      </w:r>
+      <w:proofErr w:type="spellEnd"/>
+      <w:r>
+        <w:t xml:space="preserve"> </w:t>
+      </w:r>
+      <w:proofErr w:type="spellStart"/>
+      <w:r>
+        <w:t>captată</w:t>
+      </w:r>
+      <w:proofErr w:type="spellEnd"/>
+      <w:r>
+        <w:t xml:space="preserve"> de camera de </w:t>
+      </w:r>
+      <w:proofErr w:type="spellStart"/>
+      <w:r>
+        <w:t>supraveghere</w:t>
+      </w:r>
+      <w:proofErr w:type="spellEnd"/>
+      <w:r>
+        <w:t xml:space="preserve"> </w:t>
+      </w:r>
+      <w:proofErr w:type="spellStart"/>
+      <w:r>
+        <w:t>este</w:t>
+      </w:r>
+      <w:proofErr w:type="spellEnd"/>
+      <w:r>
+        <w:t xml:space="preserve"> </w:t>
+      </w:r>
+      <w:proofErr w:type="spellStart"/>
+      <w:r>
+        <w:t>reflectată</w:t>
+      </w:r>
+      <w:proofErr w:type="spellEnd"/>
+      <w:r>
+        <w:t xml:space="preserve"> </w:t>
+      </w:r>
+      <w:proofErr w:type="spellStart"/>
+      <w:r>
+        <w:t>în</w:t>
+      </w:r>
+      <w:proofErr w:type="spellEnd"/>
+      <w:r>
+        <w:t xml:space="preserve"> </w:t>
+      </w:r>
+      <w:proofErr w:type="spellStart"/>
+      <w:r>
+        <w:t>baza</w:t>
+      </w:r>
+      <w:proofErr w:type="spellEnd"/>
+      <w:r>
+        <w:t xml:space="preserve"> de date </w:t>
+      </w:r>
+      <w:proofErr w:type="spellStart"/>
+      <w:r>
+        <w:t>și</w:t>
+      </w:r>
+      <w:proofErr w:type="spellEnd"/>
+      <w:r>
+        <w:t xml:space="preserve"> </w:t>
+      </w:r>
+      <w:proofErr w:type="spellStart"/>
+      <w:r>
+        <w:t>în</w:t>
+      </w:r>
+      <w:proofErr w:type="spellEnd"/>
+      <w:r>
+        <w:t xml:space="preserve"> </w:t>
+      </w:r>
+      <w:proofErr w:type="spellStart"/>
+      <w:r>
+        <w:t>interfața</w:t>
+      </w:r>
+      <w:proofErr w:type="spellEnd"/>
+      <w:r>
+        <w:t xml:space="preserve"> </w:t>
+      </w:r>
+      <w:proofErr w:type="spellStart"/>
+      <w:r>
+        <w:t>utilizatorului</w:t>
+      </w:r>
+      <w:proofErr w:type="spellEnd"/>
+      <w:r>
+        <w:t xml:space="preserve"> </w:t>
+      </w:r>
+      <w:proofErr w:type="spellStart"/>
+      <w:r>
+        <w:t>în</w:t>
+      </w:r>
+      <w:proofErr w:type="spellEnd"/>
+      <w:r>
+        <w:t xml:space="preserve"> </w:t>
+      </w:r>
+      <w:proofErr w:type="spellStart"/>
+      <w:r>
+        <w:t>câteva</w:t>
+      </w:r>
+      <w:proofErr w:type="spellEnd"/>
+      <w:r>
+        <w:t xml:space="preserve"> </w:t>
+      </w:r>
+      <w:proofErr w:type="spellStart"/>
+      <w:r>
+        <w:t>milisecunde</w:t>
+      </w:r>
+      <w:proofErr w:type="spellEnd"/>
+      <w:r>
+        <w:t xml:space="preserve">. </w:t>
+      </w:r>
+      <w:proofErr w:type="spellStart"/>
+      <w:r>
+        <w:rPr>
+          <w:rStyle w:val="citation-138"/>
+        </w:rPr>
+        <w:t>Pentru</w:t>
+      </w:r>
+      <w:proofErr w:type="spellEnd"/>
+      <w:r>
+        <w:rPr>
+          <w:rStyle w:val="citation-138"/>
+        </w:rPr>
+        <w:t xml:space="preserve"> </w:t>
+      </w:r>
+      <w:proofErr w:type="spellStart"/>
+      <w:r>
+        <w:rPr>
+          <w:rStyle w:val="citation-138"/>
+        </w:rPr>
+        <w:t>gestionarea</w:t>
+      </w:r>
+      <w:proofErr w:type="spellEnd"/>
+      <w:r>
+        <w:rPr>
+          <w:rStyle w:val="citation-138"/>
+        </w:rPr>
+        <w:t xml:space="preserve"> </w:t>
+      </w:r>
+      <w:proofErr w:type="spellStart"/>
+      <w:r>
+        <w:rPr>
+          <w:rStyle w:val="citation-138"/>
+        </w:rPr>
+        <w:t>acestui</w:t>
+      </w:r>
+      <w:proofErr w:type="spellEnd"/>
+      <w:r>
+        <w:rPr>
+          <w:rStyle w:val="citation-138"/>
+        </w:rPr>
+        <w:t xml:space="preserve"> flux de </w:t>
+      </w:r>
+      <w:proofErr w:type="spellStart"/>
+      <w:r>
+        <w:rPr>
+          <w:rStyle w:val="citation-138"/>
+        </w:rPr>
+        <w:t>mesaje</w:t>
+      </w:r>
+      <w:proofErr w:type="spellEnd"/>
+      <w:r>
+        <w:rPr>
+          <w:rStyle w:val="citation-138"/>
+        </w:rPr>
+        <w:t xml:space="preserve">, am </w:t>
+      </w:r>
+      <w:proofErr w:type="spellStart"/>
+      <w:r>
+        <w:rPr>
+          <w:rStyle w:val="citation-138"/>
+        </w:rPr>
+        <w:t>utilizat</w:t>
+      </w:r>
+      <w:proofErr w:type="spellEnd"/>
+      <w:r>
+        <w:rPr>
+          <w:rStyle w:val="citation-138"/>
+        </w:rPr>
+        <w:t xml:space="preserve"> </w:t>
+      </w:r>
+      <w:proofErr w:type="spellStart"/>
+      <w:r>
+        <w:rPr>
+          <w:rStyle w:val="citation-138"/>
+        </w:rPr>
+        <w:t>brokerul</w:t>
+      </w:r>
+      <w:proofErr w:type="spellEnd"/>
+      <w:r>
+        <w:rPr>
+          <w:rStyle w:val="citation-138"/>
+        </w:rPr>
+        <w:t xml:space="preserve"> Eclipse </w:t>
+      </w:r>
+      <w:proofErr w:type="spellStart"/>
+      <w:r>
+        <w:rPr>
+          <w:rStyle w:val="citation-138"/>
+        </w:rPr>
+        <w:t>Mosquitto</w:t>
+      </w:r>
+      <w:proofErr w:type="spellEnd"/>
+      <w:r>
+        <w:rPr>
+          <w:rStyle w:val="citation-138"/>
+        </w:rPr>
+        <w:t xml:space="preserve">, </w:t>
+      </w:r>
+      <w:proofErr w:type="spellStart"/>
+      <w:r>
+        <w:rPr>
+          <w:rStyle w:val="citation-138"/>
+        </w:rPr>
+        <w:t>rulat</w:t>
+      </w:r>
+      <w:proofErr w:type="spellEnd"/>
+      <w:r>
+        <w:rPr>
+          <w:rStyle w:val="citation-138"/>
+        </w:rPr>
+        <w:t xml:space="preserve"> </w:t>
+      </w:r>
+      <w:proofErr w:type="spellStart"/>
+      <w:r>
+        <w:rPr>
+          <w:rStyle w:val="citation-138"/>
+        </w:rPr>
+        <w:t>într</w:t>
+      </w:r>
+      <w:proofErr w:type="spellEnd"/>
+      <w:r>
+        <w:rPr>
+          <w:rStyle w:val="citation-138"/>
+        </w:rPr>
+        <w:t xml:space="preserve">-un container Docker </w:t>
+      </w:r>
+      <w:proofErr w:type="spellStart"/>
+      <w:r>
+        <w:rPr>
+          <w:rStyle w:val="citation-138"/>
+        </w:rPr>
+        <w:t>pentru</w:t>
+      </w:r>
+      <w:proofErr w:type="spellEnd"/>
+      <w:r>
+        <w:rPr>
+          <w:rStyle w:val="citation-138"/>
+        </w:rPr>
+        <w:t xml:space="preserve"> </w:t>
+      </w:r>
+      <w:proofErr w:type="gramStart"/>
+      <w:r>
+        <w:rPr>
+          <w:rStyle w:val="citation-138"/>
+        </w:rPr>
+        <w:t>a</w:t>
+      </w:r>
+      <w:proofErr w:type="gramEnd"/>
+      <w:r>
+        <w:rPr>
+          <w:rStyle w:val="citation-138"/>
+        </w:rPr>
+        <w:t xml:space="preserve"> </w:t>
+      </w:r>
+      <w:proofErr w:type="spellStart"/>
+      <w:r>
+        <w:rPr>
+          <w:rStyle w:val="citation-138"/>
+        </w:rPr>
+        <w:t>asigura</w:t>
+      </w:r>
+      <w:proofErr w:type="spellEnd"/>
+      <w:r>
+        <w:rPr>
+          <w:rStyle w:val="citation-138"/>
+        </w:rPr>
+        <w:t xml:space="preserve"> o </w:t>
+      </w:r>
+      <w:proofErr w:type="spellStart"/>
+      <w:r>
+        <w:rPr>
+          <w:rStyle w:val="citation-138"/>
+        </w:rPr>
+        <w:t>stabilitate</w:t>
+      </w:r>
+      <w:proofErr w:type="spellEnd"/>
+      <w:r>
+        <w:rPr>
+          <w:rStyle w:val="citation-138"/>
+        </w:rPr>
+        <w:t xml:space="preserve"> </w:t>
+      </w:r>
+      <w:proofErr w:type="spellStart"/>
+      <w:r>
+        <w:rPr>
+          <w:rStyle w:val="citation-138"/>
+        </w:rPr>
+        <w:t>ridicată</w:t>
+      </w:r>
+      <w:proofErr w:type="spellEnd"/>
+      <w:r>
+        <w:rPr>
+          <w:rStyle w:val="citation-138"/>
+        </w:rPr>
+        <w:t xml:space="preserve"> </w:t>
+      </w:r>
+      <w:proofErr w:type="spellStart"/>
+      <w:r>
+        <w:rPr>
+          <w:rStyle w:val="citation-138"/>
+        </w:rPr>
+        <w:t>și</w:t>
+      </w:r>
+      <w:proofErr w:type="spellEnd"/>
+      <w:r>
+        <w:rPr>
+          <w:rStyle w:val="citation-138"/>
+        </w:rPr>
+        <w:t xml:space="preserve"> o </w:t>
+      </w:r>
+      <w:proofErr w:type="spellStart"/>
+      <w:r>
+        <w:rPr>
+          <w:rStyle w:val="citation-138"/>
+        </w:rPr>
+        <w:t>izolare</w:t>
+      </w:r>
+      <w:proofErr w:type="spellEnd"/>
+      <w:r>
+        <w:rPr>
+          <w:rStyle w:val="citation-138"/>
+        </w:rPr>
+        <w:t xml:space="preserve"> </w:t>
+      </w:r>
+      <w:proofErr w:type="spellStart"/>
+      <w:r>
+        <w:rPr>
+          <w:rStyle w:val="citation-138"/>
+        </w:rPr>
+        <w:t>eficientă</w:t>
+      </w:r>
+      <w:proofErr w:type="spellEnd"/>
+      <w:r>
+        <w:rPr>
+          <w:rStyle w:val="citation-138"/>
+        </w:rPr>
+        <w:t xml:space="preserve"> a </w:t>
+      </w:r>
+      <w:proofErr w:type="spellStart"/>
+      <w:r>
+        <w:rPr>
+          <w:rStyle w:val="citation-138"/>
+        </w:rPr>
+        <w:t>serviciului</w:t>
+      </w:r>
+      <w:proofErr w:type="spellEnd"/>
+      <w:r>
+        <w:rPr>
+          <w:rStyle w:val="citation-138"/>
+        </w:rPr>
+        <w:t xml:space="preserve"> de </w:t>
+      </w:r>
+      <w:proofErr w:type="spellStart"/>
+      <w:r>
+        <w:rPr>
+          <w:rStyle w:val="citation-138"/>
+        </w:rPr>
+        <w:t>comunicație</w:t>
+      </w:r>
+      <w:proofErr w:type="spellEnd"/>
+      <w:r>
+        <w:rPr>
+          <w:rStyle w:val="citation-138"/>
+        </w:rPr>
+        <w:t xml:space="preserve"> </w:t>
+      </w:r>
+      <w:proofErr w:type="spellStart"/>
+      <w:r>
+        <w:rPr>
+          <w:rStyle w:val="citation-138"/>
+        </w:rPr>
+        <w:t>în</w:t>
+      </w:r>
+      <w:proofErr w:type="spellEnd"/>
+      <w:r>
+        <w:rPr>
+          <w:rStyle w:val="citation-138"/>
+        </w:rPr>
+        <w:t xml:space="preserve"> </w:t>
+      </w:r>
+      <w:proofErr w:type="spellStart"/>
+      <w:r>
+        <w:rPr>
+          <w:rStyle w:val="citation-138"/>
+        </w:rPr>
+        <w:t>cadrul</w:t>
+      </w:r>
+      <w:proofErr w:type="spellEnd"/>
+      <w:r>
+        <w:rPr>
+          <w:rStyle w:val="citation-138"/>
+        </w:rPr>
+        <w:t xml:space="preserve"> </w:t>
+      </w:r>
+      <w:proofErr w:type="spellStart"/>
+      <w:r>
+        <w:rPr>
+          <w:rStyle w:val="citation-138"/>
+        </w:rPr>
+        <w:t>infrastructurii</w:t>
+      </w:r>
+      <w:proofErr w:type="spellEnd"/>
+    </w:p>
+    <w:p>
+      <w:pPr>
+        <w:pStyle w:val="Heading2"/>
+        <w:rPr>
+          <w:sz w:val="24"/>
+          <w:szCs w:val="24"/>
+          <w:lang w:eastAsia="en-GB"/>
+        </w:rPr>
+      </w:pPr>
+      <w:r>
+        <w:t>2.9 Limbajul Python și Biblioteca OpenCV</w:t>
+      </w:r>
+    </w:p>
+    <w:p>
+      <w:pPr>
+        <w:pStyle w:val="NormalWeb"/>
+      </w:pPr>
+      <w:proofErr w:type="spellStart"/>
+      <w:r>
+        <w:t>Pentru</w:t>
+      </w:r>
+      <w:proofErr w:type="spellEnd"/>
+      <w:r>
+        <w:t xml:space="preserve"> </w:t>
+      </w:r>
+      <w:proofErr w:type="spellStart"/>
+      <w:r>
+        <w:t>partea</w:t>
+      </w:r>
+      <w:proofErr w:type="spellEnd"/>
+      <w:r>
+        <w:t xml:space="preserve"> de </w:t>
+      </w:r>
+      <w:proofErr w:type="spellStart"/>
+      <w:r>
+        <w:t>inteligență</w:t>
+      </w:r>
+      <w:proofErr w:type="spellEnd"/>
+      <w:r>
+        <w:t xml:space="preserve"> </w:t>
+      </w:r>
+      <w:proofErr w:type="spellStart"/>
+      <w:r>
+        <w:t>vizuală</w:t>
+      </w:r>
+      <w:proofErr w:type="spellEnd"/>
+      <w:r>
+        <w:t xml:space="preserve"> a </w:t>
+      </w:r>
+      <w:proofErr w:type="spellStart"/>
+      <w:r>
+        <w:t>sistemului</w:t>
+      </w:r>
+      <w:proofErr w:type="spellEnd"/>
+      <w:r>
+        <w:t xml:space="preserve">, am ales </w:t>
+      </w:r>
+      <w:proofErr w:type="spellStart"/>
+      <w:r>
+        <w:t>limbajul</w:t>
+      </w:r>
+      <w:proofErr w:type="spellEnd"/>
+      <w:r>
+        <w:t xml:space="preserve"> Python </w:t>
+      </w:r>
+      <w:proofErr w:type="spellStart"/>
+      <w:r>
+        <w:t>datorită</w:t>
+      </w:r>
+      <w:proofErr w:type="spellEnd"/>
+      <w:r>
+        <w:t xml:space="preserve"> </w:t>
+      </w:r>
+      <w:proofErr w:type="spellStart"/>
+      <w:r>
+        <w:t>simplității</w:t>
+      </w:r>
+      <w:proofErr w:type="spellEnd"/>
+      <w:r>
+        <w:t xml:space="preserve"> sale </w:t>
+      </w:r>
+      <w:proofErr w:type="spellStart"/>
+      <w:r>
+        <w:t>și</w:t>
+      </w:r>
+      <w:proofErr w:type="spellEnd"/>
+      <w:r>
+        <w:t xml:space="preserve"> a </w:t>
+      </w:r>
+      <w:proofErr w:type="spellStart"/>
+      <w:r>
+        <w:t>suportului</w:t>
+      </w:r>
+      <w:proofErr w:type="spellEnd"/>
+      <w:r>
+        <w:t xml:space="preserve"> </w:t>
+      </w:r>
+      <w:proofErr w:type="spellStart"/>
+      <w:r>
+        <w:t>imens</w:t>
+      </w:r>
+      <w:proofErr w:type="spellEnd"/>
+      <w:r>
+        <w:t xml:space="preserve"> </w:t>
+      </w:r>
+      <w:proofErr w:type="spellStart"/>
+      <w:r>
+        <w:t>pentru</w:t>
+      </w:r>
+      <w:proofErr w:type="spellEnd"/>
+      <w:r>
+        <w:t xml:space="preserve"> </w:t>
+      </w:r>
+      <w:proofErr w:type="spellStart"/>
+      <w:r>
+        <w:t>algoritmi</w:t>
+      </w:r>
+      <w:proofErr w:type="spellEnd"/>
+      <w:r>
+        <w:t xml:space="preserve"> de </w:t>
+      </w:r>
+      <w:proofErr w:type="spellStart"/>
+      <w:r>
+        <w:t>analiză</w:t>
+      </w:r>
+      <w:proofErr w:type="spellEnd"/>
+      <w:r>
+        <w:t xml:space="preserve"> video. "</w:t>
+      </w:r>
+      <w:proofErr w:type="spellStart"/>
+      <w:r>
+        <w:t>Creierul</w:t>
+      </w:r>
+      <w:proofErr w:type="spellEnd"/>
+      <w:r>
+        <w:t xml:space="preserve">" care </w:t>
+      </w:r>
+      <w:proofErr w:type="spellStart"/>
+      <w:r>
+        <w:t>analizează</w:t>
+      </w:r>
+      <w:proofErr w:type="spellEnd"/>
+      <w:r>
+        <w:t xml:space="preserve"> </w:t>
+      </w:r>
+      <w:proofErr w:type="spellStart"/>
+      <w:r>
+        <w:t>imaginile</w:t>
+      </w:r>
+      <w:proofErr w:type="spellEnd"/>
+      <w:r>
+        <w:t xml:space="preserve"> </w:t>
+      </w:r>
+      <w:proofErr w:type="spellStart"/>
+      <w:r>
+        <w:t>este</w:t>
+      </w:r>
+      <w:proofErr w:type="spellEnd"/>
+      <w:r>
+        <w:t xml:space="preserve"> </w:t>
+      </w:r>
+      <w:proofErr w:type="spellStart"/>
+      <w:r>
+        <w:t>biblioteca</w:t>
+      </w:r>
+      <w:proofErr w:type="spellEnd"/>
+      <w:r>
+        <w:t xml:space="preserve"> OpenCV (</w:t>
+      </w:r>
+      <w:proofErr w:type="gramStart"/>
+      <w:r>
+        <w:t>Open Source</w:t>
+      </w:r>
+      <w:proofErr w:type="gramEnd"/>
+      <w:r>
+        <w:t xml:space="preserve"> Computer Vision). </w:t>
+      </w:r>
+      <w:proofErr w:type="spellStart"/>
+      <w:r>
+        <w:t>Dacă</w:t>
+      </w:r>
+      <w:proofErr w:type="spellEnd"/>
+      <w:r>
+        <w:t xml:space="preserve"> </w:t>
+      </w:r>
+      <w:proofErr w:type="spellStart"/>
+      <w:r>
+        <w:t>ar</w:t>
+      </w:r>
+      <w:proofErr w:type="spellEnd"/>
+      <w:r>
+        <w:t xml:space="preserve"> fi </w:t>
+      </w:r>
+      <w:proofErr w:type="spellStart"/>
+      <w:r>
+        <w:t>să</w:t>
+      </w:r>
+      <w:proofErr w:type="spellEnd"/>
+      <w:r>
+        <w:t xml:space="preserve"> </w:t>
+      </w:r>
+      <w:proofErr w:type="spellStart"/>
+      <w:r>
+        <w:t>facem</w:t>
+      </w:r>
+      <w:proofErr w:type="spellEnd"/>
+      <w:r>
+        <w:t xml:space="preserve"> o </w:t>
+      </w:r>
+      <w:proofErr w:type="spellStart"/>
+      <w:r>
+        <w:t>analogie</w:t>
+      </w:r>
+      <w:proofErr w:type="spellEnd"/>
+      <w:r>
+        <w:t xml:space="preserve">, Python </w:t>
+      </w:r>
+      <w:proofErr w:type="spellStart"/>
+      <w:r>
+        <w:t>este</w:t>
+      </w:r>
+      <w:proofErr w:type="spellEnd"/>
+      <w:r>
+        <w:t xml:space="preserve"> </w:t>
+      </w:r>
+      <w:proofErr w:type="spellStart"/>
+      <w:r>
+        <w:t>scriitorul</w:t>
+      </w:r>
+      <w:proofErr w:type="spellEnd"/>
+      <w:r>
+        <w:t xml:space="preserve">, </w:t>
+      </w:r>
+      <w:proofErr w:type="spellStart"/>
+      <w:r>
+        <w:t>iar</w:t>
+      </w:r>
+      <w:proofErr w:type="spellEnd"/>
+      <w:r>
+        <w:t xml:space="preserve"> OpenCV sunt "</w:t>
+      </w:r>
+      <w:proofErr w:type="spellStart"/>
+      <w:r>
+        <w:t>ochii</w:t>
+      </w:r>
+      <w:proofErr w:type="spellEnd"/>
+      <w:r>
+        <w:t xml:space="preserve">" </w:t>
+      </w:r>
+      <w:proofErr w:type="spellStart"/>
+      <w:r>
+        <w:t>și</w:t>
+      </w:r>
+      <w:proofErr w:type="spellEnd"/>
+      <w:r>
+        <w:t xml:space="preserve"> "</w:t>
+      </w:r>
+      <w:proofErr w:type="spellStart"/>
+      <w:r>
+        <w:t>logica</w:t>
+      </w:r>
+      <w:proofErr w:type="spellEnd"/>
+      <w:r>
+        <w:t xml:space="preserve">" </w:t>
+      </w:r>
+      <w:proofErr w:type="spellStart"/>
+      <w:r>
+        <w:t>acestuia</w:t>
+      </w:r>
+      <w:proofErr w:type="spellEnd"/>
+      <w:r>
+        <w:t xml:space="preserve">: </w:t>
+      </w:r>
+      <w:proofErr w:type="spellStart"/>
+      <w:r>
+        <w:t>biblioteca</w:t>
+      </w:r>
+      <w:proofErr w:type="spellEnd"/>
+      <w:r>
+        <w:t xml:space="preserve"> </w:t>
+      </w:r>
+      <w:proofErr w:type="spellStart"/>
+      <w:r>
+        <w:t>îi</w:t>
+      </w:r>
+      <w:proofErr w:type="spellEnd"/>
+      <w:r>
+        <w:t xml:space="preserve"> </w:t>
+      </w:r>
+      <w:proofErr w:type="spellStart"/>
+      <w:r>
+        <w:t>permite</w:t>
+      </w:r>
+      <w:proofErr w:type="spellEnd"/>
+      <w:r>
+        <w:t xml:space="preserve"> </w:t>
+      </w:r>
+      <w:proofErr w:type="spellStart"/>
+      <w:r>
+        <w:t>programului</w:t>
+      </w:r>
+      <w:proofErr w:type="spellEnd"/>
+      <w:r>
+        <w:t xml:space="preserve"> </w:t>
+      </w:r>
+      <w:proofErr w:type="spellStart"/>
+      <w:r>
+        <w:t>să</w:t>
+      </w:r>
+      <w:proofErr w:type="spellEnd"/>
+      <w:r>
+        <w:t xml:space="preserve"> </w:t>
+      </w:r>
+      <w:proofErr w:type="spellStart"/>
+      <w:r>
+        <w:t>recunoască</w:t>
+      </w:r>
+      <w:proofErr w:type="spellEnd"/>
+      <w:r>
+        <w:t xml:space="preserve"> </w:t>
+      </w:r>
+      <w:proofErr w:type="spellStart"/>
+      <w:r>
+        <w:t>forme</w:t>
+      </w:r>
+      <w:proofErr w:type="spellEnd"/>
+      <w:r>
+        <w:t xml:space="preserve"> (</w:t>
+      </w:r>
+      <w:proofErr w:type="spellStart"/>
+      <w:r>
+        <w:t>mașini</w:t>
+      </w:r>
+      <w:proofErr w:type="spellEnd"/>
+      <w:r>
+        <w:t xml:space="preserve">) </w:t>
+      </w:r>
+      <w:proofErr w:type="spellStart"/>
+      <w:r>
+        <w:t>și</w:t>
+      </w:r>
+      <w:proofErr w:type="spellEnd"/>
+      <w:r>
+        <w:t xml:space="preserve"> </w:t>
+      </w:r>
+      <w:proofErr w:type="spellStart"/>
+      <w:r>
+        <w:t>culori</w:t>
+      </w:r>
+      <w:proofErr w:type="spellEnd"/>
+      <w:r>
+        <w:t xml:space="preserve"> </w:t>
+      </w:r>
+      <w:proofErr w:type="spellStart"/>
+      <w:r>
+        <w:t>în</w:t>
+      </w:r>
+      <w:proofErr w:type="spellEnd"/>
+      <w:r>
+        <w:t xml:space="preserve"> </w:t>
+      </w:r>
+      <w:proofErr w:type="spellStart"/>
+      <w:r>
+        <w:t>fluxul</w:t>
+      </w:r>
+      <w:proofErr w:type="spellEnd"/>
+      <w:r>
+        <w:t xml:space="preserve"> video </w:t>
+      </w:r>
+      <w:proofErr w:type="spellStart"/>
+      <w:r>
+        <w:t>captat</w:t>
+      </w:r>
+      <w:proofErr w:type="spellEnd"/>
+      <w:r>
+        <w:t xml:space="preserve"> de </w:t>
+      </w:r>
+      <w:proofErr w:type="spellStart"/>
+      <w:r>
+        <w:t>cameră</w:t>
+      </w:r>
+      <w:proofErr w:type="spellEnd"/>
+      <w:r>
+        <w:t xml:space="preserve">, </w:t>
+      </w:r>
+      <w:proofErr w:type="spellStart"/>
+      <w:r>
+        <w:t>transformând</w:t>
+      </w:r>
+      <w:proofErr w:type="spellEnd"/>
+      <w:r>
+        <w:t xml:space="preserve"> </w:t>
+      </w:r>
+      <w:proofErr w:type="spellStart"/>
+      <w:r>
+        <w:t>niște</w:t>
+      </w:r>
+      <w:proofErr w:type="spellEnd"/>
+      <w:r>
+        <w:t xml:space="preserve"> </w:t>
+      </w:r>
+      <w:proofErr w:type="spellStart"/>
+      <w:r>
+        <w:t>pixeli</w:t>
+      </w:r>
+      <w:proofErr w:type="spellEnd"/>
+      <w:r>
+        <w:t xml:space="preserve"> de pe un </w:t>
+      </w:r>
+      <w:proofErr w:type="spellStart"/>
+      <w:r>
+        <w:t>ecran</w:t>
+      </w:r>
+      <w:proofErr w:type="spellEnd"/>
+      <w:r>
+        <w:t xml:space="preserve"> </w:t>
+      </w:r>
+      <w:proofErr w:type="spellStart"/>
+      <w:r>
+        <w:t>în</w:t>
+      </w:r>
+      <w:proofErr w:type="spellEnd"/>
+      <w:r>
+        <w:t xml:space="preserve"> </w:t>
+      </w:r>
+      <w:proofErr w:type="spellStart"/>
+      <w:r>
+        <w:t>informații</w:t>
+      </w:r>
+      <w:proofErr w:type="spellEnd"/>
+      <w:r>
+        <w:t xml:space="preserve"> utile </w:t>
+      </w:r>
+      <w:proofErr w:type="spellStart"/>
+      <w:r>
+        <w:t>despre</w:t>
+      </w:r>
+      <w:proofErr w:type="spellEnd"/>
+      <w:r>
+        <w:t xml:space="preserve"> </w:t>
+      </w:r>
+      <w:proofErr w:type="spellStart"/>
+      <w:r>
+        <w:t>ocuparea</w:t>
+      </w:r>
+      <w:proofErr w:type="spellEnd"/>
+      <w:r>
+        <w:t xml:space="preserve"> </w:t>
+      </w:r>
+      <w:proofErr w:type="spellStart"/>
+      <w:r>
+        <w:t>locurilor</w:t>
+      </w:r>
+      <w:proofErr w:type="spellEnd"/>
+      <w:r>
+        <w:t xml:space="preserve"> de </w:t>
+      </w:r>
+      <w:proofErr w:type="spellStart"/>
+      <w:r>
+        <w:t>parcare</w:t>
+      </w:r>
+      <w:proofErr w:type="spellEnd"/>
+      <w:r>
+        <w:t>.</w:t>
+      </w:r>
+    </w:p>
+    <w:p>
+      <w:pPr>
+        <w:pStyle w:val="Heading2"/>
+        <w:rPr>
+          <w:sz w:val="24"/>
+          <w:szCs w:val="24"/>
+          <w:lang w:eastAsia="en-GB"/>
+        </w:rPr>
+      </w:pPr>
+      <w:r>
+        <w:t>2.10 Microcontroller-ul ESP32-CAM și Modulul de Scanare QR</w:t>
+      </w:r>
+    </w:p>
+    <w:p>
+      <w:pPr>
+        <w:pStyle w:val="NormalWeb"/>
+      </w:pPr>
+      <w:r>
+        <w:t xml:space="preserve">Hardware-ul </w:t>
+      </w:r>
+      <w:proofErr w:type="spellStart"/>
+      <w:r>
+        <w:t>este</w:t>
+      </w:r>
+      <w:proofErr w:type="spellEnd"/>
+      <w:r>
+        <w:t xml:space="preserve"> </w:t>
+      </w:r>
+      <w:proofErr w:type="spellStart"/>
+      <w:r>
+        <w:t>puntea</w:t>
+      </w:r>
+      <w:proofErr w:type="spellEnd"/>
+      <w:r>
+        <w:t xml:space="preserve"> </w:t>
+      </w:r>
+      <w:proofErr w:type="spellStart"/>
+      <w:r>
+        <w:t>dintre</w:t>
+      </w:r>
+      <w:proofErr w:type="spellEnd"/>
+      <w:r>
+        <w:t xml:space="preserve"> </w:t>
+      </w:r>
+      <w:proofErr w:type="spellStart"/>
+      <w:r>
+        <w:t>lumea</w:t>
+      </w:r>
+      <w:proofErr w:type="spellEnd"/>
+      <w:r>
+        <w:t xml:space="preserve"> </w:t>
+      </w:r>
+      <w:proofErr w:type="spellStart"/>
+      <w:r>
+        <w:t>digitală</w:t>
+      </w:r>
+      <w:proofErr w:type="spellEnd"/>
+      <w:r>
+        <w:t xml:space="preserve"> </w:t>
+      </w:r>
+      <w:proofErr w:type="spellStart"/>
+      <w:r>
+        <w:t>și</w:t>
+      </w:r>
+      <w:proofErr w:type="spellEnd"/>
+      <w:r>
+        <w:t xml:space="preserve"> </w:t>
+      </w:r>
+      <w:proofErr w:type="spellStart"/>
+      <w:r>
+        <w:t>cea</w:t>
+      </w:r>
+      <w:proofErr w:type="spellEnd"/>
+      <w:r>
+        <w:t xml:space="preserve"> </w:t>
+      </w:r>
+      <w:proofErr w:type="spellStart"/>
+      <w:r>
+        <w:t>fizică</w:t>
+      </w:r>
+      <w:proofErr w:type="spellEnd"/>
+      <w:r>
+        <w:t xml:space="preserve">. ESP32-CAM </w:t>
+      </w:r>
+      <w:proofErr w:type="spellStart"/>
+      <w:r>
+        <w:t>este</w:t>
+      </w:r>
+      <w:proofErr w:type="spellEnd"/>
+      <w:r>
+        <w:t xml:space="preserve"> o </w:t>
+      </w:r>
+      <w:proofErr w:type="spellStart"/>
+      <w:r>
+        <w:t>placă</w:t>
+      </w:r>
+      <w:proofErr w:type="spellEnd"/>
+      <w:r>
+        <w:t xml:space="preserve"> de </w:t>
+      </w:r>
+      <w:proofErr w:type="spellStart"/>
+      <w:r>
+        <w:t>dezvoltare</w:t>
+      </w:r>
+      <w:proofErr w:type="spellEnd"/>
+      <w:r>
+        <w:t xml:space="preserve"> </w:t>
+      </w:r>
+      <w:proofErr w:type="spellStart"/>
+      <w:r>
+        <w:t>minusculă</w:t>
+      </w:r>
+      <w:proofErr w:type="spellEnd"/>
+      <w:r>
+        <w:t xml:space="preserve"> care include o </w:t>
+      </w:r>
+      <w:proofErr w:type="spellStart"/>
+      <w:r>
+        <w:t>cameră</w:t>
+      </w:r>
+      <w:proofErr w:type="spellEnd"/>
+      <w:r>
+        <w:t xml:space="preserve"> video </w:t>
+      </w:r>
+      <w:proofErr w:type="spellStart"/>
+      <w:r>
+        <w:t>și</w:t>
+      </w:r>
+      <w:proofErr w:type="spellEnd"/>
+      <w:r>
+        <w:t xml:space="preserve"> </w:t>
+      </w:r>
+      <w:proofErr w:type="spellStart"/>
+      <w:r>
+        <w:t>conexiune</w:t>
+      </w:r>
+      <w:proofErr w:type="spellEnd"/>
+      <w:r>
+        <w:t xml:space="preserve"> Wi-Fi. </w:t>
+      </w:r>
+      <w:proofErr w:type="spellStart"/>
+      <w:r>
+        <w:t>Rolul</w:t>
+      </w:r>
+      <w:proofErr w:type="spellEnd"/>
+      <w:r>
+        <w:t xml:space="preserve"> </w:t>
+      </w:r>
+      <w:proofErr w:type="spellStart"/>
+      <w:r>
+        <w:t>ei</w:t>
+      </w:r>
+      <w:proofErr w:type="spellEnd"/>
+      <w:r>
+        <w:t xml:space="preserve"> </w:t>
+      </w:r>
+      <w:proofErr w:type="spellStart"/>
+      <w:r>
+        <w:t>este</w:t>
+      </w:r>
+      <w:proofErr w:type="spellEnd"/>
+      <w:r>
+        <w:t xml:space="preserve"> de a </w:t>
+      </w:r>
+      <w:proofErr w:type="spellStart"/>
+      <w:r>
+        <w:t>transmite</w:t>
+      </w:r>
+      <w:proofErr w:type="spellEnd"/>
+      <w:r>
+        <w:t xml:space="preserve"> </w:t>
+      </w:r>
+      <w:proofErr w:type="spellStart"/>
+      <w:r>
+        <w:t>imaginea</w:t>
+      </w:r>
+      <w:proofErr w:type="spellEnd"/>
+      <w:r>
+        <w:t xml:space="preserve"> de pe </w:t>
+      </w:r>
+      <w:proofErr w:type="spellStart"/>
+      <w:r>
+        <w:t>teren</w:t>
+      </w:r>
+      <w:proofErr w:type="spellEnd"/>
+      <w:r>
+        <w:t xml:space="preserve"> </w:t>
+      </w:r>
+      <w:proofErr w:type="spellStart"/>
+      <w:r>
+        <w:t>către</w:t>
+      </w:r>
+      <w:proofErr w:type="spellEnd"/>
+      <w:r>
+        <w:t xml:space="preserve"> server. </w:t>
+      </w:r>
+      <w:proofErr w:type="spellStart"/>
+      <w:r>
+        <w:t>Separat</w:t>
+      </w:r>
+      <w:proofErr w:type="spellEnd"/>
+      <w:r>
+        <w:t xml:space="preserve">, am </w:t>
+      </w:r>
+      <w:proofErr w:type="spellStart"/>
+      <w:r>
+        <w:t>utilizat</w:t>
+      </w:r>
+      <w:proofErr w:type="spellEnd"/>
+      <w:r>
+        <w:t xml:space="preserve"> un scanner optic de </w:t>
+      </w:r>
+      <w:proofErr w:type="spellStart"/>
+      <w:r>
+        <w:t>coduri</w:t>
+      </w:r>
+      <w:proofErr w:type="spellEnd"/>
+      <w:r>
+        <w:t xml:space="preserve"> QR la </w:t>
+      </w:r>
+      <w:proofErr w:type="spellStart"/>
+      <w:r>
+        <w:t>intrare</w:t>
+      </w:r>
+      <w:proofErr w:type="spellEnd"/>
+      <w:r>
+        <w:t xml:space="preserve">. </w:t>
+      </w:r>
+      <w:proofErr w:type="spellStart"/>
+      <w:r>
+        <w:t>Acesta</w:t>
+      </w:r>
+      <w:proofErr w:type="spellEnd"/>
+      <w:r>
+        <w:t xml:space="preserve"> </w:t>
+      </w:r>
+      <w:proofErr w:type="spellStart"/>
+      <w:r>
+        <w:t>funcționează</w:t>
+      </w:r>
+      <w:proofErr w:type="spellEnd"/>
+      <w:r>
+        <w:t xml:space="preserve"> exact ca un scanner de la casa de </w:t>
+      </w:r>
+      <w:proofErr w:type="spellStart"/>
+      <w:r>
+        <w:t>marcat</w:t>
+      </w:r>
+      <w:proofErr w:type="spellEnd"/>
+      <w:r>
+        <w:t xml:space="preserve"> </w:t>
+      </w:r>
+      <w:proofErr w:type="spellStart"/>
+      <w:r>
+        <w:t>dintr</w:t>
+      </w:r>
+      <w:proofErr w:type="spellEnd"/>
+      <w:r>
+        <w:t xml:space="preserve">-un supermarket: </w:t>
+      </w:r>
+      <w:proofErr w:type="spellStart"/>
+      <w:r>
+        <w:t>citește</w:t>
+      </w:r>
+      <w:proofErr w:type="spellEnd"/>
+      <w:r>
+        <w:t xml:space="preserve"> </w:t>
+      </w:r>
+      <w:proofErr w:type="spellStart"/>
+      <w:r>
+        <w:t>instantaneu</w:t>
+      </w:r>
+      <w:proofErr w:type="spellEnd"/>
+      <w:r>
+        <w:t xml:space="preserve"> </w:t>
+      </w:r>
+      <w:proofErr w:type="spellStart"/>
+      <w:r>
+        <w:t>codul</w:t>
+      </w:r>
+      <w:proofErr w:type="spellEnd"/>
+      <w:r>
+        <w:t xml:space="preserve"> de pe </w:t>
+      </w:r>
+      <w:proofErr w:type="spellStart"/>
+      <w:r>
+        <w:t>telefonul</w:t>
+      </w:r>
+      <w:proofErr w:type="spellEnd"/>
+      <w:r>
+        <w:t xml:space="preserve"> </w:t>
+      </w:r>
+      <w:proofErr w:type="spellStart"/>
+      <w:r>
+        <w:t>utilizatorului</w:t>
+      </w:r>
+      <w:proofErr w:type="spellEnd"/>
+      <w:r>
+        <w:t xml:space="preserve"> </w:t>
+      </w:r>
+      <w:proofErr w:type="spellStart"/>
+      <w:r>
+        <w:t>și</w:t>
+      </w:r>
+      <w:proofErr w:type="spellEnd"/>
+      <w:r>
+        <w:t xml:space="preserve"> </w:t>
+      </w:r>
+      <w:proofErr w:type="spellStart"/>
+      <w:r>
+        <w:t>trimite</w:t>
+      </w:r>
+      <w:proofErr w:type="spellEnd"/>
+      <w:r>
+        <w:t xml:space="preserve"> un </w:t>
+      </w:r>
+      <w:proofErr w:type="spellStart"/>
+      <w:r>
+        <w:t>semnal</w:t>
+      </w:r>
+      <w:proofErr w:type="spellEnd"/>
+      <w:r>
+        <w:t xml:space="preserve"> </w:t>
+      </w:r>
+      <w:proofErr w:type="spellStart"/>
+      <w:r>
+        <w:t>către</w:t>
+      </w:r>
+      <w:proofErr w:type="spellEnd"/>
+      <w:r>
+        <w:t xml:space="preserve"> </w:t>
+      </w:r>
+      <w:proofErr w:type="spellStart"/>
+      <w:r>
+        <w:t>barieră</w:t>
+      </w:r>
+      <w:proofErr w:type="spellEnd"/>
+      <w:r>
+        <w:t xml:space="preserve"> </w:t>
+      </w:r>
+      <w:proofErr w:type="spellStart"/>
+      <w:r>
+        <w:t>pentru</w:t>
+      </w:r>
+      <w:proofErr w:type="spellEnd"/>
+      <w:r>
+        <w:t xml:space="preserve"> a se </w:t>
+      </w:r>
+      <w:proofErr w:type="spellStart"/>
+      <w:r>
+        <w:t>deschide</w:t>
+      </w:r>
+      <w:proofErr w:type="spellEnd"/>
+      <w:r>
+        <w:t xml:space="preserve">, </w:t>
+      </w:r>
+      <w:proofErr w:type="spellStart"/>
+      <w:r>
+        <w:t>eliminând</w:t>
+      </w:r>
+      <w:proofErr w:type="spellEnd"/>
+      <w:r>
+        <w:t xml:space="preserve"> </w:t>
+      </w:r>
+      <w:proofErr w:type="spellStart"/>
+      <w:r>
+        <w:t>erorile</w:t>
+      </w:r>
+      <w:proofErr w:type="spellEnd"/>
+      <w:r>
+        <w:t xml:space="preserve"> </w:t>
+      </w:r>
+      <w:proofErr w:type="spellStart"/>
+      <w:r>
+        <w:t>umane</w:t>
+      </w:r>
+      <w:proofErr w:type="spellEnd"/>
+      <w:r>
+        <w:t xml:space="preserve"> </w:t>
+      </w:r>
+      <w:proofErr w:type="spellStart"/>
+      <w:r>
+        <w:t>sau</w:t>
+      </w:r>
+      <w:proofErr w:type="spellEnd"/>
+      <w:r>
+        <w:t xml:space="preserve"> </w:t>
+      </w:r>
+      <w:proofErr w:type="spellStart"/>
+      <w:r>
+        <w:t>întârzierile</w:t>
+      </w:r>
+      <w:proofErr w:type="spellEnd"/>
+      <w:r>
+        <w:t xml:space="preserve"> de </w:t>
+      </w:r>
+      <w:proofErr w:type="spellStart"/>
+      <w:r>
+        <w:t>autentificare</w:t>
+      </w:r>
+      <w:proofErr w:type="spellEnd"/>
+      <w:r>
+        <w:t>.</w:t>
       </w:r>
     </w:p>
     <w:p>
@@ -12812,66 +15501,79 @@
       </w:pPr>
       <w:bookmarkStart w:id="16" w:name="_Toc216965837"/>
       <w:r>
-        <w:t>2.9 Pachete și Biblioteci Auxiliare</w:t>
+        <w:t>2.</w:t>
+      </w:r>
+      <w:r>
+        <w:t>11</w:t>
+      </w:r>
+      <w:r>
+        <w:t xml:space="preserve"> Pachete și Biblioteci Auxiliare</w:t>
       </w:r>
       <w:bookmarkEnd w:id="16"/>
     </w:p>
     <w:p>
       <w:pPr>
-        <w:ind w:firstLine="360"/>
-      </w:pPr>
-      <w:r>
-        <w:t>Pe lângă tehnologiile de bază, am integrat câteva biblioteci esențiale pentru a completa funcționalitățile:</w:t>
-      </w:r>
-    </w:p>
-    <w:p>
-      <w:pPr>
-        <w:pStyle w:val="ListParagraph"/>
-        <w:numPr>
-          <w:ilvl w:val="0"/>
-          <w:numId w:val="6"/>
-        </w:numPr>
-      </w:pPr>
-      <w:r>
-        <w:t>Passport.js &amp; JWT: Pentru securitate, am implementat autentificarea pe bază de token-uri (JSON Web Tokens).</w:t>
-      </w:r>
-    </w:p>
-    <w:p>
-      <w:pPr>
-        <w:pStyle w:val="ListParagraph"/>
-        <w:numPr>
-          <w:ilvl w:val="0"/>
-          <w:numId w:val="6"/>
-        </w:numPr>
-      </w:pPr>
-      <w:r>
-        <w:t>Bcrypt: Folosit pentru criptarea (hashing) parolelor înainte de a fi salvate în bază, protejând astfel conturile utilizatorilor.</w:t>
-      </w:r>
-    </w:p>
-    <w:p>
-      <w:pPr>
-        <w:pStyle w:val="ListParagraph"/>
-        <w:numPr>
-          <w:ilvl w:val="0"/>
-          <w:numId w:val="6"/>
-        </w:numPr>
-      </w:pPr>
-      <w:r>
-        <w:t>Class-Validator: Asigură validarea automată a datelor care vin de la client (prin DTO - Data Transfer Objects), respingând cererile care nu respectă formatul corect.</w:t>
-      </w:r>
-    </w:p>
-    <w:p>
-      <w:pPr>
-        <w:pStyle w:val="ListParagraph"/>
-        <w:numPr>
-          <w:ilvl w:val="0"/>
-          <w:numId w:val="6"/>
-        </w:numPr>
-      </w:pPr>
-      <w:r>
-        <w:t>Google Maps Flutter: Am integrat hărțile pentru a oferi funcții de navigare direct în aplicație.</w:t>
-      </w:r>
-    </w:p>
+        <w:spacing w:before="100" w:beforeAutospacing="1" w:after="100" w:afterAutospacing="1" w:line="240" w:lineRule="auto"/>
+        <w:jc w:val="left"/>
+        <w:rPr>
+          <w:rFonts w:eastAsia="Times New Roman"/>
+          <w:lang w:val="en-RO" w:eastAsia="en-GB"/>
+        </w:rPr>
+      </w:pPr>
+      <w:r>
+        <w:rPr>
+          <w:rFonts w:eastAsia="Times New Roman"/>
+          <w:lang w:val="en-RO" w:eastAsia="en-GB"/>
+        </w:rPr>
+        <w:t>Pentru a completa funcționalitățile de bază și pentru a asigura un nivel ridicat de securitate și performanță, dezvoltarea ecosistemului a necesitat integrarea unor biblioteci software specializate. Un pilon central al noii metode de detecție este reprezentat de biblioteca OpenCV (Open Source Computer Vision Library) utilizată în scriptul Python pentru analiza în timp real a fluxului video. Aceasta permite definirea unor regiuni de interes corespunzătoare locurilor de parcare și aplicarea algoritmilor de procesare a imaginii pentru a determina prezența vehiculelor. Comunicarea acestei logici cu restul sistemului este facilitată de biblioteca Paho-MQTT, care permite integrarea nativă a scriptului de analiză video în rețeaua de mesagerie a proiectului.</w:t>
+      </w:r>
+    </w:p>
+    <w:p>
+      <w:pPr>
+        <w:spacing w:before="100" w:beforeAutospacing="1" w:after="100" w:afterAutospacing="1" w:line="240" w:lineRule="auto"/>
+        <w:jc w:val="left"/>
+        <w:rPr>
+          <w:rFonts w:eastAsia="Times New Roman"/>
+          <w:lang w:val="en-RO" w:eastAsia="en-GB"/>
+        </w:rPr>
+      </w:pPr>
+      <w:r>
+        <w:rPr>
+          <w:rFonts w:eastAsia="Times New Roman"/>
+          <w:lang w:val="en-RO" w:eastAsia="en-GB"/>
+        </w:rPr>
+        <w:t xml:space="preserve">Securitatea datelor și a accesului este gestionată prin utilizarea bibliotecilor Passport.js și JWT (JSON Web Tokens), care permit implementarea unui sistem robust de autentificare pe bază de token-uri, esențial pentru protejarea profilurilor de utilizator și a istoricului sesiunilor de parcare. Protecția informațiilor sensibile este întărită prin utilizarea Bcrypt pentru procesul de hashing al parolelor înainte de stocarea acestora în baza de date PostgreSQL. Pe partea de server, integritatea datelor primite de la clienți este garantată de Class-Validator, care asigură </w:t>
+      </w:r>
+      <w:r>
+        <w:rPr>
+          <w:rFonts w:eastAsia="Times New Roman"/>
+          <w:lang w:val="en-RO" w:eastAsia="en-GB"/>
+        </w:rPr>
+        <w:lastRenderedPageBreak/>
+        <w:t>verificarea automată a obiectelor de transfer de date (DTO), eliminând riscul procesării unor cereri malformate sau incomplete.</w:t>
+      </w:r>
+    </w:p>
+    <w:p>
+      <w:pPr>
+        <w:spacing w:before="100" w:beforeAutospacing="1" w:after="100" w:afterAutospacing="1" w:line="240" w:lineRule="auto"/>
+        <w:jc w:val="left"/>
+        <w:rPr>
+          <w:rFonts w:eastAsia="Times New Roman"/>
+          <w:lang w:val="en-RO" w:eastAsia="en-GB"/>
+        </w:rPr>
+      </w:pPr>
+      <w:r>
+        <w:rPr>
+          <w:rFonts w:eastAsia="Times New Roman"/>
+          <w:lang w:val="en-RO" w:eastAsia="en-GB"/>
+        </w:rPr>
+        <w:t>În final, experiența vizuală și funcționalitatea de ghidare din cadrul aplicației mobile sunt susținute de pachetul Google Maps Flutter, care permite integrarea hărților interactive și afișarea dinamică a markerelor de stare pentru locurile de parcare. Pentru modulul de acces la barieră, am utilizat biblioteci dedicate scanării optice, care permit scannerului hardware să comunice rapid cu API-ul de backend pentru validarea codurilor QR prezentate de utilizatori. Această suită de instrumente auxiliare transformă prototipul într-o soluție integrată, capabilă să gestioneze simultan procesarea vizuală complexă, securitatea cibernetică și o interfață utilizator intuitivă.</w:t>
+      </w:r>
+    </w:p>
+    <w:p/>
+    <w:p/>
+    <w:p/>
+    <w:p/>
     <w:p/>
     <w:p>
       <w:pPr>
@@ -12983,7 +15685,6 @@
         <w:pStyle w:val="Heading3"/>
       </w:pPr>
       <w:r>
-        <w:lastRenderedPageBreak/>
         <w:t>3.1.2 Test intern (Unit &amp; Widget Testing)</w:t>
       </w:r>
     </w:p>
@@ -13097,60 +15798,13 @@
         <w:t>Deși proiectul este un prototip academic, etapa de "producție" este reprezentată de demonstrația finală funcțională. Sistemul este pregătit să ruleze autonom, cu serverul gestionând conexiunile multiple și aplicația mobilă ghidând utilizatorul în timp real pe macheta fizică.</w:t>
       </w:r>
     </w:p>
-    <w:p>
-      <w:pPr>
-        <w:ind w:firstLine="720"/>
-      </w:pPr>
-    </w:p>
-    <w:p>
-      <w:pPr>
-        <w:ind w:firstLine="720"/>
-      </w:pPr>
-    </w:p>
-    <w:p>
-      <w:pPr>
-        <w:ind w:firstLine="720"/>
-      </w:pPr>
-    </w:p>
-    <w:p>
-      <w:pPr>
-        <w:ind w:firstLine="720"/>
-      </w:pPr>
-    </w:p>
-    <w:p>
-      <w:pPr>
-        <w:ind w:firstLine="720"/>
-      </w:pPr>
-    </w:p>
-    <w:p>
-      <w:pPr>
-        <w:ind w:firstLine="720"/>
-      </w:pPr>
-    </w:p>
-    <w:p>
-      <w:pPr>
-        <w:ind w:firstLine="720"/>
-      </w:pPr>
-    </w:p>
-    <w:p>
-      <w:pPr>
-        <w:ind w:firstLine="720"/>
-      </w:pPr>
-    </w:p>
-    <w:p>
-      <w:pPr>
-        <w:ind w:firstLine="720"/>
-      </w:pPr>
-    </w:p>
     <w:p/>
     <w:p/>
-    <w:p/>
     <w:p>
       <w:pPr>
         <w:pStyle w:val="Heading2"/>
       </w:pPr>
       <w:r>
-        <w:lastRenderedPageBreak/>
         <w:t>3.2 Setarea mediului de dezvoltare</w:t>
       </w:r>
     </w:p>
@@ -13195,6 +15849,7 @@
         </w:numPr>
       </w:pPr>
       <w:r>
+        <w:lastRenderedPageBreak/>
         <w:t>Scripturi de automatizare: Am creat scripturi Python (start.py) pentru a automatiza pornirea întregului ecosistem cu o singură comandă, detectând automat adresa IP locală pentru a configura conexiunea dintre telefon și server.</w:t>
       </w:r>
     </w:p>
@@ -13257,6 +15912,7 @@
       </w:pPr>
     </w:p>
     <w:p/>
+    <w:p/>
     <w:p>
       <w:pPr>
         <w:pStyle w:val="Heading2"/>
@@ -13320,14 +15976,11 @@
     <w:p/>
     <w:p/>
     <w:p/>
-    <w:p/>
-    <w:p/>
     <w:p>
       <w:pPr>
         <w:pStyle w:val="Heading2"/>
       </w:pPr>
       <w:r>
-        <w:lastRenderedPageBreak/>
         <w:t>3.5 Dezvoltarea aplicației mobile (Frontend)</w:t>
       </w:r>
     </w:p>
@@ -13385,6 +16038,7 @@
         <w:pStyle w:val="Heading2"/>
       </w:pPr>
       <w:r>
+        <w:lastRenderedPageBreak/>
         <w:t>3.6 Integrarea Hardware și Macheta</w:t>
       </w:r>
     </w:p>
@@ -13405,7 +16059,47 @@
         </w:numPr>
       </w:pPr>
       <w:r>
-        <w:t>Calibrare: Am mapat coordonatele GPS reale ale colțurilor machetei fizice în sistem, permițând aplicației să știe exact unde se află utilizatorul pe machetă.</w:t>
+        <w:rPr>
+          <w:rStyle w:val="citation-109"/>
+        </w:rPr>
+        <w:t>Calibrare Vizuală</w:t>
+      </w:r>
+      <w:r>
+        <w:rPr>
+          <w:rStyle w:val="citation-109"/>
+        </w:rPr>
+        <w:t xml:space="preserve">: Am definit în scriptul de procesare regiuni de interes (ROI - </w:t>
+      </w:r>
+      <w:proofErr w:type="spellStart"/>
+      <w:r>
+        <w:rPr>
+          <w:rStyle w:val="citation-109"/>
+        </w:rPr>
+        <w:t>Regions</w:t>
+      </w:r>
+      <w:proofErr w:type="spellEnd"/>
+      <w:r>
+        <w:rPr>
+          <w:rStyle w:val="citation-109"/>
+        </w:rPr>
+        <w:t xml:space="preserve"> of </w:t>
+      </w:r>
+      <w:proofErr w:type="spellStart"/>
+      <w:r>
+        <w:rPr>
+          <w:rStyle w:val="citation-109"/>
+        </w:rPr>
+        <w:t>Interest</w:t>
+      </w:r>
+      <w:proofErr w:type="spellEnd"/>
+      <w:r>
+        <w:rPr>
+          <w:rStyle w:val="citation-109"/>
+        </w:rPr>
+        <w:t xml:space="preserve">) corespunzătoare fiecărui loc de parcare de pe machetă. Această mapare 1:1 între coordonatele imaginii video și identificatorii din baza de date (A1-B10) asigură acuratețea semnalizării prin LED-uri și a navigației în aplicație </w:t>
+      </w:r>
+      <w:r>
+        <w:t>să știe exact unde se află utilizatorul pe machetă.</w:t>
       </w:r>
     </w:p>
     <w:p>
@@ -16463,6 +19157,56 @@
       <w:szCs w:val="18"/>
     </w:rPr>
   </w:style>
+  <w:style w:type="character" w:customStyle="1" w:styleId="citation-141">
+    <w:name w:val="citation-141"/>
+    <w:basedOn w:val="DefaultParagraphFont"/>
+    <w:rsid w:val="0054714C"/>
+  </w:style>
+  <w:style w:type="character" w:customStyle="1" w:styleId="citation-140">
+    <w:name w:val="citation-140"/>
+    <w:basedOn w:val="DefaultParagraphFont"/>
+    <w:rsid w:val="0054714C"/>
+  </w:style>
+  <w:style w:type="character" w:customStyle="1" w:styleId="citation-139">
+    <w:name w:val="citation-139"/>
+    <w:basedOn w:val="DefaultParagraphFont"/>
+    <w:rsid w:val="0054714C"/>
+  </w:style>
+  <w:style w:type="character" w:customStyle="1" w:styleId="citation-138">
+    <w:name w:val="citation-138"/>
+    <w:basedOn w:val="DefaultParagraphFont"/>
+    <w:rsid w:val="0054714C"/>
+  </w:style>
+  <w:style w:type="character" w:customStyle="1" w:styleId="citation-137">
+    <w:name w:val="citation-137"/>
+    <w:basedOn w:val="DefaultParagraphFont"/>
+    <w:rsid w:val="0054714C"/>
+  </w:style>
+  <w:style w:type="character" w:customStyle="1" w:styleId="citation-136">
+    <w:name w:val="citation-136"/>
+    <w:basedOn w:val="DefaultParagraphFont"/>
+    <w:rsid w:val="0054714C"/>
+  </w:style>
+  <w:style w:type="character" w:customStyle="1" w:styleId="citation-135">
+    <w:name w:val="citation-135"/>
+    <w:basedOn w:val="DefaultParagraphFont"/>
+    <w:rsid w:val="0054714C"/>
+  </w:style>
+  <w:style w:type="character" w:customStyle="1" w:styleId="button-label">
+    <w:name w:val="button-label"/>
+    <w:basedOn w:val="DefaultParagraphFont"/>
+    <w:rsid w:val="0054714C"/>
+  </w:style>
+  <w:style w:type="character" w:customStyle="1" w:styleId="citation-134">
+    <w:name w:val="citation-134"/>
+    <w:basedOn w:val="DefaultParagraphFont"/>
+    <w:rsid w:val="0054714C"/>
+  </w:style>
+  <w:style w:type="character" w:customStyle="1" w:styleId="citation-109">
+    <w:name w:val="citation-109"/>
+    <w:basedOn w:val="DefaultParagraphFont"/>
+    <w:rsid w:val="007E3199"/>
+  </w:style>
 </w:styles>
 </file>
 
@@ -16762,7 +19506,12 @@
 </file>
 
 <file path=customXml/item1.xml><?xml version="1.0" encoding="utf-8"?>
-<b:Sources xmlns:b="http://schemas.openxmlformats.org/officeDocument/2006/bibliography" xmlns="http://schemas.openxmlformats.org/officeDocument/2006/bibliography" SelectedStyle="\APASixthEditionOfficeOnline.xsl" StyleName="APA" Version="6"/>
+<?mso-contentType ?>
+<FormTemplates xmlns="http://schemas.microsoft.com/sharepoint/v3/contenttype/forms">
+  <Display>DocumentLibraryForm</Display>
+  <Edit>DocumentLibraryForm</Edit>
+  <New>DocumentLibraryForm</New>
+</FormTemplates>
 </file>
 
 <file path=customXml/item2.xml><?xml version="1.0" encoding="utf-8"?>
@@ -16922,18 +19671,13 @@
 </file>
 
 <file path=customXml/item3.xml><?xml version="1.0" encoding="utf-8"?>
-<?mso-contentType ?>
-<FormTemplates xmlns="http://schemas.microsoft.com/sharepoint/v3/contenttype/forms">
-  <Display>DocumentLibraryForm</Display>
-  <Edit>DocumentLibraryForm</Edit>
-  <New>DocumentLibraryForm</New>
-</FormTemplates>
+<b:Sources xmlns:b="http://schemas.openxmlformats.org/officeDocument/2006/bibliography" xmlns="http://schemas.openxmlformats.org/officeDocument/2006/bibliography" SelectedStyle="\APASixthEditionOfficeOnline.xsl" StyleName="APA" Version="6"/>
 </file>
 
 <file path=customXml/itemProps1.xml><?xml version="1.0" encoding="utf-8"?>
-<ds:datastoreItem xmlns:ds="http://schemas.openxmlformats.org/officeDocument/2006/customXml" ds:itemID="{F804BE94-7B99-42CB-9101-506226C23FAF}">
+<ds:datastoreItem xmlns:ds="http://schemas.openxmlformats.org/officeDocument/2006/customXml" ds:itemID="{297FFA09-1118-4E31-AA64-B1A3A1FF522A}">
   <ds:schemaRefs>
-    <ds:schemaRef ds:uri="http://schemas.openxmlformats.org/officeDocument/2006/bibliography"/>
+    <ds:schemaRef ds:uri="http://schemas.microsoft.com/sharepoint/v3/contenttype/forms"/>
   </ds:schemaRefs>
 </ds:datastoreItem>
 </file>
@@ -16957,9 +19701,9 @@
 </file>
 
 <file path=customXml/itemProps3.xml><?xml version="1.0" encoding="utf-8"?>
-<ds:datastoreItem xmlns:ds="http://schemas.openxmlformats.org/officeDocument/2006/customXml" ds:itemID="{297FFA09-1118-4E31-AA64-B1A3A1FF522A}">
+<ds:datastoreItem xmlns:ds="http://schemas.openxmlformats.org/officeDocument/2006/customXml" ds:itemID="{F804BE94-7B99-42CB-9101-506226C23FAF}">
   <ds:schemaRefs>
-    <ds:schemaRef ds:uri="http://schemas.microsoft.com/sharepoint/v3/contenttype/forms"/>
+    <ds:schemaRef ds:uri="http://schemas.openxmlformats.org/officeDocument/2006/bibliography"/>
   </ds:schemaRefs>
 </ds:datastoreItem>
 </file>
</xml_diff>